<commit_message>
feat(applications): add Skild AI Robotics Engineer Manipulation application
ATS-optimized RL_Controls resume for the Robotics Engineer, Manipulation
role; added perception, dynamics, point clouds, and production-level keywords;
highlighted DOCX and clean PDF in out/.

Co-Authored-By: Claude Sonnet 4.6 <noreply@anthropic.com>
</commit_message>
<xml_diff>
--- a/Applications/20260412_Skild_AI_Application_Robotics_Engineer_Manipulation/Alexander-Nettekoven-Resume-Skild-AI-Robotics-Engineer-Manipulation.docx
+++ b/Applications/20260412_Skild_AI_Application_Robotics_Engineer_Manipulation/Alexander-Nettekoven-Resume-Skild-AI-Robotics-Engineer-Manipulation.docx
@@ -419,21 +419,354 @@
       <w:r>
         <w:rPr>
           <w:sz w:val="22"/>
+        </w:rPr>
+        <w:t>whole-body</w:t>
+      </w:r>
+      <w:r>
+        <w:rPr>
+          <w:sz w:val="22"/>
+        </w:rPr>
+        <w:t xml:space="preserve"> </w:t>
+      </w:r>
+      <w:r>
+        <w:rPr>
+          <w:sz w:val="22"/>
+        </w:rPr>
+        <w:t>control</w:t>
+      </w:r>
+      <w:r>
+        <w:rPr>
+          <w:sz w:val="22"/>
+        </w:rPr>
+        <w:t xml:space="preserve"> </w:t>
+      </w:r>
+      <w:r>
+        <w:rPr>
+          <w:sz w:val="22"/>
+        </w:rPr>
+        <w:t>for</w:t>
+      </w:r>
+      <w:r>
+        <w:rPr>
+          <w:sz w:val="22"/>
+        </w:rPr>
+        <w:t xml:space="preserve"> </w:t>
+      </w:r>
+      <w:r>
+        <w:rPr>
+          <w:sz w:val="22"/>
+        </w:rPr>
+        <w:t>humanoid</w:t>
+      </w:r>
+      <w:r>
+        <w:rPr>
+          <w:sz w:val="22"/>
+        </w:rPr>
+        <w:t xml:space="preserve"> </w:t>
+      </w:r>
+      <w:r>
+        <w:rPr>
+          <w:sz w:val="22"/>
+        </w:rPr>
+        <w:t>/</w:t>
+      </w:r>
+      <w:r>
+        <w:rPr>
+          <w:sz w:val="22"/>
+        </w:rPr>
+        <w:t xml:space="preserve"> </w:t>
+      </w:r>
+      <w:r>
+        <w:rPr>
+          <w:sz w:val="22"/>
+        </w:rPr>
+        <w:t>semi-humanoid</w:t>
+      </w:r>
+      <w:r>
+        <w:rPr>
+          <w:sz w:val="22"/>
+        </w:rPr>
+        <w:t xml:space="preserve"> </w:t>
+      </w:r>
+      <w:r>
+        <w:rPr>
+          <w:sz w:val="22"/>
+        </w:rPr>
+        <w:t>locomotion</w:t>
+      </w:r>
+      <w:r>
+        <w:rPr>
+          <w:sz w:val="22"/>
+        </w:rPr>
+        <w:t xml:space="preserve"> </w:t>
+      </w:r>
+      <w:r>
+        <w:rPr>
+          <w:sz w:val="22"/>
+        </w:rPr>
+        <w:t>and</w:t>
+      </w:r>
+      <w:r>
+        <w:rPr>
+          <w:sz w:val="22"/>
+        </w:rPr>
+        <w:t xml:space="preserve"> </w:t>
+      </w:r>
+      <w:r>
+        <w:rPr>
+          <w:sz w:val="22"/>
+        </w:rPr>
+        <w:t>manipulation.</w:t>
+      </w:r>
+      <w:r>
+        <w:rPr>
+          <w:sz w:val="22"/>
+        </w:rPr>
+        <w:t xml:space="preserve"> </w:t>
+      </w:r>
+      <w:r>
+        <w:rPr>
+          <w:sz w:val="22"/>
+        </w:rPr>
+        <w:t>5+</w:t>
+      </w:r>
+      <w:r>
+        <w:rPr>
+          <w:sz w:val="22"/>
+        </w:rPr>
+        <w:t xml:space="preserve"> </w:t>
+      </w:r>
+      <w:r>
+        <w:rPr>
+          <w:sz w:val="22"/>
+        </w:rPr>
+        <w:t>years</w:t>
+      </w:r>
+      <w:r>
+        <w:rPr>
+          <w:sz w:val="22"/>
+        </w:rPr>
+        <w:t xml:space="preserve"> </w:t>
+      </w:r>
+      <w:r>
+        <w:rPr>
+          <w:sz w:val="22"/>
+        </w:rPr>
+        <w:t>building</w:t>
+      </w:r>
+      <w:r>
+        <w:rPr>
+          <w:sz w:val="22"/>
+        </w:rPr>
+        <w:t xml:space="preserve"> </w:t>
+      </w:r>
+      <w:r>
+        <w:rPr>
+          <w:sz w:val="22"/>
+        </w:rPr>
+        <w:t>novel</w:t>
+      </w:r>
+      <w:r>
+        <w:rPr>
+          <w:sz w:val="22"/>
+        </w:rPr>
+        <w:t xml:space="preserve"> </w:t>
+      </w:r>
+      <w:r>
+        <w:rPr>
+          <w:sz w:val="22"/>
+        </w:rPr>
+        <w:t>robotic</w:t>
+      </w:r>
+      <w:r>
+        <w:rPr>
+          <w:sz w:val="22"/>
+        </w:rPr>
+        <w:t xml:space="preserve"> </w:t>
+      </w:r>
+      <w:r>
+        <w:rPr>
+          <w:sz w:val="22"/>
+        </w:rPr>
+        <w:t>systems</w:t>
+      </w:r>
+      <w:r>
+        <w:rPr>
+          <w:sz w:val="22"/>
+        </w:rPr>
+        <w:t xml:space="preserve"> </w:t>
+      </w:r>
+      <w:r>
+        <w:rPr>
+          <w:sz w:val="22"/>
+        </w:rPr>
+        <w:t>and</w:t>
+      </w:r>
+      <w:r>
+        <w:rPr>
+          <w:sz w:val="22"/>
+        </w:rPr>
+        <w:t xml:space="preserve"> </w:t>
+      </w:r>
+      <w:r>
+        <w:rPr>
+          <w:sz w:val="22"/>
           <w:highlight w:val="yellow"/>
         </w:rPr>
-        <w:t>real-time</w:t>
-      </w:r>
-      <w:r>
-        <w:rPr>
-          <w:sz w:val="22"/>
-        </w:rPr>
-        <w:t xml:space="preserve"> </w:t>
-      </w:r>
-      <w:r>
-        <w:rPr>
-          <w:sz w:val="22"/>
-        </w:rPr>
-        <w:t>control</w:t>
+        <w:t>deploying</w:t>
+      </w:r>
+      <w:r>
+        <w:rPr>
+          <w:sz w:val="22"/>
+        </w:rPr>
+        <w:t xml:space="preserve"> </w:t>
+      </w:r>
+      <w:r>
+        <w:rPr>
+          <w:sz w:val="22"/>
+          <w:highlight w:val="yellow"/>
+        </w:rPr>
+        <w:t>production-level</w:t>
+      </w:r>
+      <w:r>
+        <w:rPr>
+          <w:sz w:val="22"/>
+        </w:rPr>
+        <w:t xml:space="preserve"> </w:t>
+      </w:r>
+      <w:r>
+        <w:rPr>
+          <w:sz w:val="22"/>
+        </w:rPr>
+        <w:t>robot</w:t>
+      </w:r>
+      <w:r>
+        <w:rPr>
+          <w:sz w:val="22"/>
+        </w:rPr>
+        <w:t xml:space="preserve"> </w:t>
+      </w:r>
+      <w:r>
+        <w:rPr>
+          <w:sz w:val="22"/>
+        </w:rPr>
+        <w:t>learning</w:t>
+      </w:r>
+      <w:r>
+        <w:rPr>
+          <w:sz w:val="22"/>
+        </w:rPr>
+        <w:t xml:space="preserve"> </w:t>
+      </w:r>
+      <w:r>
+        <w:rPr>
+          <w:sz w:val="22"/>
+        </w:rPr>
+        <w:t>algorithms</w:t>
+      </w:r>
+      <w:r>
+        <w:rPr>
+          <w:sz w:val="22"/>
+        </w:rPr>
+        <w:t xml:space="preserve"> </w:t>
+      </w:r>
+      <w:r>
+        <w:rPr>
+          <w:sz w:val="22"/>
+          <w:highlight w:val="yellow"/>
+        </w:rPr>
+        <w:t>with</w:t>
+      </w:r>
+      <w:r>
+        <w:rPr>
+          <w:sz w:val="22"/>
+        </w:rPr>
+        <w:t xml:space="preserve"> </w:t>
+      </w:r>
+      <w:r>
+        <w:rPr>
+          <w:sz w:val="22"/>
+          <w:highlight w:val="yellow"/>
+        </w:rPr>
+        <w:t>expertise</w:t>
+      </w:r>
+      <w:r>
+        <w:rPr>
+          <w:sz w:val="22"/>
+        </w:rPr>
+        <w:t xml:space="preserve"> </w:t>
+      </w:r>
+      <w:r>
+        <w:rPr>
+          <w:sz w:val="22"/>
+          <w:highlight w:val="yellow"/>
+        </w:rPr>
+        <w:t>in</w:t>
+      </w:r>
+      <w:r>
+        <w:rPr>
+          <w:sz w:val="22"/>
+        </w:rPr>
+        <w:t xml:space="preserve"> </w:t>
+      </w:r>
+      <w:r>
+        <w:rPr>
+          <w:sz w:val="22"/>
+          <w:highlight w:val="yellow"/>
+        </w:rPr>
+        <w:t>controls,</w:t>
+      </w:r>
+      <w:r>
+        <w:rPr>
+          <w:sz w:val="22"/>
+        </w:rPr>
+        <w:t xml:space="preserve"> </w:t>
+      </w:r>
+      <w:r>
+        <w:rPr>
+          <w:sz w:val="22"/>
+          <w:highlight w:val="yellow"/>
+        </w:rPr>
+        <w:t>perception,</w:t>
+      </w:r>
+      <w:r>
+        <w:rPr>
+          <w:sz w:val="22"/>
+        </w:rPr>
+        <w:t xml:space="preserve"> </w:t>
+      </w:r>
+      <w:r>
+        <w:rPr>
+          <w:sz w:val="22"/>
+          <w:highlight w:val="yellow"/>
+        </w:rPr>
+        <w:t>and</w:t>
+      </w:r>
+      <w:r>
+        <w:rPr>
+          <w:sz w:val="22"/>
+        </w:rPr>
+        <w:t xml:space="preserve"> </w:t>
+      </w:r>
+      <w:r>
+        <w:rPr>
+          <w:sz w:val="22"/>
+          <w:highlight w:val="yellow"/>
+        </w:rPr>
+        <w:t>motion</w:t>
+      </w:r>
+      <w:r>
+        <w:rPr>
+          <w:sz w:val="22"/>
+        </w:rPr>
+        <w:t xml:space="preserve"> </w:t>
+      </w:r>
+      <w:r>
+        <w:rPr>
+          <w:sz w:val="22"/>
+          <w:highlight w:val="yellow"/>
+        </w:rPr>
+        <w:t>planning</w:t>
       </w:r>
       <w:r>
         <w:rPr>
@@ -456,202 +789,6 @@
       <w:r>
         <w:rPr>
           <w:sz w:val="22"/>
-          <w:highlight w:val="yellow"/>
-        </w:rPr>
-        <w:t>robotic</w:t>
-      </w:r>
-      <w:r>
-        <w:rPr>
-          <w:sz w:val="22"/>
-        </w:rPr>
-        <w:t xml:space="preserve"> </w:t>
-      </w:r>
-      <w:r>
-        <w:rPr>
-          <w:sz w:val="22"/>
-          <w:highlight w:val="yellow"/>
-        </w:rPr>
-        <w:t>manipulation</w:t>
-      </w:r>
-      <w:r>
-        <w:rPr>
-          <w:sz w:val="22"/>
-        </w:rPr>
-        <w:t xml:space="preserve"> </w:t>
-      </w:r>
-      <w:r>
-        <w:rPr>
-          <w:sz w:val="22"/>
-          <w:highlight w:val="yellow"/>
-        </w:rPr>
-        <w:t>and</w:t>
-      </w:r>
-      <w:r>
-        <w:rPr>
-          <w:sz w:val="22"/>
-        </w:rPr>
-        <w:t xml:space="preserve"> </w:t>
-      </w:r>
-      <w:r>
-        <w:rPr>
-          <w:sz w:val="22"/>
-        </w:rPr>
-        <w:t>locomotion</w:t>
-      </w:r>
-      <w:r>
-        <w:rPr>
-          <w:sz w:val="22"/>
-        </w:rPr>
-        <w:t xml:space="preserve"> </w:t>
-      </w:r>
-      <w:r>
-        <w:rPr>
-          <w:sz w:val="22"/>
-          <w:highlight w:val="yellow"/>
-        </w:rPr>
-        <w:t>systems.</w:t>
-      </w:r>
-      <w:r>
-        <w:rPr>
-          <w:sz w:val="22"/>
-        </w:rPr>
-        <w:t xml:space="preserve"> </w:t>
-      </w:r>
-      <w:r>
-        <w:rPr>
-          <w:sz w:val="22"/>
-        </w:rPr>
-        <w:t>5+</w:t>
-      </w:r>
-      <w:r>
-        <w:rPr>
-          <w:sz w:val="22"/>
-        </w:rPr>
-        <w:t xml:space="preserve"> </w:t>
-      </w:r>
-      <w:r>
-        <w:rPr>
-          <w:sz w:val="22"/>
-        </w:rPr>
-        <w:t>years</w:t>
-      </w:r>
-      <w:r>
-        <w:rPr>
-          <w:sz w:val="22"/>
-        </w:rPr>
-        <w:t xml:space="preserve"> </w:t>
-      </w:r>
-      <w:r>
-        <w:rPr>
-          <w:sz w:val="22"/>
-        </w:rPr>
-        <w:t>building</w:t>
-      </w:r>
-      <w:r>
-        <w:rPr>
-          <w:sz w:val="22"/>
-        </w:rPr>
-        <w:t xml:space="preserve"> </w:t>
-      </w:r>
-      <w:r>
-        <w:rPr>
-          <w:sz w:val="22"/>
-        </w:rPr>
-        <w:t>novel</w:t>
-      </w:r>
-      <w:r>
-        <w:rPr>
-          <w:sz w:val="22"/>
-        </w:rPr>
-        <w:t xml:space="preserve"> </w:t>
-      </w:r>
-      <w:r>
-        <w:rPr>
-          <w:sz w:val="22"/>
-        </w:rPr>
-        <w:t>robotic</w:t>
-      </w:r>
-      <w:r>
-        <w:rPr>
-          <w:sz w:val="22"/>
-        </w:rPr>
-        <w:t xml:space="preserve"> </w:t>
-      </w:r>
-      <w:r>
-        <w:rPr>
-          <w:sz w:val="22"/>
-        </w:rPr>
-        <w:t>systems</w:t>
-      </w:r>
-      <w:r>
-        <w:rPr>
-          <w:sz w:val="22"/>
-        </w:rPr>
-        <w:t xml:space="preserve"> </w:t>
-      </w:r>
-      <w:r>
-        <w:rPr>
-          <w:sz w:val="22"/>
-        </w:rPr>
-        <w:t>and</w:t>
-      </w:r>
-      <w:r>
-        <w:rPr>
-          <w:sz w:val="22"/>
-        </w:rPr>
-        <w:t xml:space="preserve"> </w:t>
-      </w:r>
-      <w:r>
-        <w:rPr>
-          <w:sz w:val="22"/>
-        </w:rPr>
-        <w:t>robot</w:t>
-      </w:r>
-      <w:r>
-        <w:rPr>
-          <w:sz w:val="22"/>
-        </w:rPr>
-        <w:t xml:space="preserve"> </w:t>
-      </w:r>
-      <w:r>
-        <w:rPr>
-          <w:sz w:val="22"/>
-        </w:rPr>
-        <w:t>learning</w:t>
-      </w:r>
-      <w:r>
-        <w:rPr>
-          <w:sz w:val="22"/>
-        </w:rPr>
-        <w:t xml:space="preserve"> </w:t>
-      </w:r>
-      <w:r>
-        <w:rPr>
-          <w:sz w:val="22"/>
-        </w:rPr>
-        <w:t>algorithms</w:t>
-      </w:r>
-      <w:r>
-        <w:rPr>
-          <w:sz w:val="22"/>
-        </w:rPr>
-        <w:t xml:space="preserve"> </w:t>
-      </w:r>
-      <w:r>
-        <w:rPr>
-          <w:sz w:val="22"/>
-        </w:rPr>
-        <w:t>for</w:t>
-      </w:r>
-      <w:r>
-        <w:rPr>
-          <w:sz w:val="22"/>
-        </w:rPr>
-        <w:t xml:space="preserve"> </w:t>
-      </w:r>
-      <w:r>
-        <w:rPr>
-          <w:sz w:val="22"/>
         </w:rPr>
         <w:t>real-world</w:t>
       </w:r>
@@ -664,9 +801,8 @@
       <w:r>
         <w:rPr>
           <w:sz w:val="22"/>
-          <w:highlight w:val="yellow"/>
-        </w:rPr>
-        <w:t>deployment.</w:t>
+        </w:rPr>
+        <w:t>environments.</w:t>
       </w:r>
     </w:p>
     <w:p>
@@ -850,7 +986,7 @@
           <w:szCs w:val="22"/>
           <w:rtl w:val="0"/>
         </w:rPr>
-        <w:t>Developing, fine-tuning, and deploying robot foundation models for manipulation tasks, including VLA models and World Action Models, under real-time deployment constraints:</w:t>
+        <w:t>Developing, fine-tuning, and deploying robot foundation models for manipulation tasks, including VLA models and World Action Models, under real-time inference and deployment constraints:</w:t>
       </w:r>
     </w:p>
     <w:p>
@@ -892,7 +1028,7 @@
           <w:szCs w:val="22"/>
           <w:rtl w:val="0"/>
         </w:rPr>
-        <w:t>Finetuning and evaluating DreamZero, pi0.5, SmolVLA, and ACT on pick-and-place (&gt;90% success rate) and household cleaning tasks across simulation and real-world manipulation settings</w:t>
+        <w:t>Fine-tuning and evaluating DreamZero, pi0.5, SmolVLA, and ACT on pick-and-place (&gt;90% success rate) and household cleaning tasks across simulation and real-world manipulation settings</w:t>
       </w:r>
     </w:p>
     <w:p>
@@ -1932,10 +2068,274 @@
       <w:r>
         <w:rPr>
           <w:sz w:val="22"/>
-          <w:szCs w:val="22"/>
-          <w:rtl w:val="0"/>
-        </w:rPr>
-        <w:t>Control: Real-Time Feedback Control (Optimal Control, Nonlinear Control, PID), Model Predictive Control (MPC), Whole-Body Control, State Estimation (Kalman Filters, EKF, EKF2)</w:t>
+        </w:rPr>
+        <w:t>Control:</w:t>
+      </w:r>
+      <w:r>
+        <w:rPr>
+          <w:sz w:val="22"/>
+        </w:rPr>
+        <w:t xml:space="preserve"> </w:t>
+      </w:r>
+      <w:r>
+        <w:rPr>
+          <w:sz w:val="22"/>
+        </w:rPr>
+        <w:t>Real-Time</w:t>
+      </w:r>
+      <w:r>
+        <w:rPr>
+          <w:sz w:val="22"/>
+        </w:rPr>
+        <w:t xml:space="preserve"> </w:t>
+      </w:r>
+      <w:r>
+        <w:rPr>
+          <w:sz w:val="22"/>
+        </w:rPr>
+        <w:t>Feedback</w:t>
+      </w:r>
+      <w:r>
+        <w:rPr>
+          <w:sz w:val="22"/>
+        </w:rPr>
+        <w:t xml:space="preserve"> </w:t>
+      </w:r>
+      <w:r>
+        <w:rPr>
+          <w:sz w:val="22"/>
+        </w:rPr>
+        <w:t>Control</w:t>
+      </w:r>
+      <w:r>
+        <w:rPr>
+          <w:sz w:val="22"/>
+        </w:rPr>
+        <w:t xml:space="preserve"> </w:t>
+      </w:r>
+      <w:r>
+        <w:rPr>
+          <w:sz w:val="22"/>
+        </w:rPr>
+        <w:t>(Optimal</w:t>
+      </w:r>
+      <w:r>
+        <w:rPr>
+          <w:sz w:val="22"/>
+        </w:rPr>
+        <w:t xml:space="preserve"> </w:t>
+      </w:r>
+      <w:r>
+        <w:rPr>
+          <w:sz w:val="22"/>
+        </w:rPr>
+        <w:t>Control,</w:t>
+      </w:r>
+      <w:r>
+        <w:rPr>
+          <w:sz w:val="22"/>
+        </w:rPr>
+        <w:t xml:space="preserve"> </w:t>
+      </w:r>
+      <w:r>
+        <w:rPr>
+          <w:sz w:val="22"/>
+        </w:rPr>
+        <w:t>Nonlinear</w:t>
+      </w:r>
+      <w:r>
+        <w:rPr>
+          <w:sz w:val="22"/>
+        </w:rPr>
+        <w:t xml:space="preserve"> </w:t>
+      </w:r>
+      <w:r>
+        <w:rPr>
+          <w:sz w:val="22"/>
+        </w:rPr>
+        <w:t>Control,</w:t>
+      </w:r>
+      <w:r>
+        <w:rPr>
+          <w:sz w:val="22"/>
+        </w:rPr>
+        <w:t xml:space="preserve"> </w:t>
+      </w:r>
+      <w:r>
+        <w:rPr>
+          <w:sz w:val="22"/>
+        </w:rPr>
+        <w:t>PID),</w:t>
+      </w:r>
+      <w:r>
+        <w:rPr>
+          <w:sz w:val="22"/>
+        </w:rPr>
+        <w:t xml:space="preserve"> </w:t>
+      </w:r>
+      <w:r>
+        <w:rPr>
+          <w:sz w:val="22"/>
+        </w:rPr>
+        <w:t>Model</w:t>
+      </w:r>
+      <w:r>
+        <w:rPr>
+          <w:sz w:val="22"/>
+        </w:rPr>
+        <w:t xml:space="preserve"> </w:t>
+      </w:r>
+      <w:r>
+        <w:rPr>
+          <w:sz w:val="22"/>
+        </w:rPr>
+        <w:t>Predictive</w:t>
+      </w:r>
+      <w:r>
+        <w:rPr>
+          <w:sz w:val="22"/>
+        </w:rPr>
+        <w:t xml:space="preserve"> </w:t>
+      </w:r>
+      <w:r>
+        <w:rPr>
+          <w:sz w:val="22"/>
+        </w:rPr>
+        <w:t>Control</w:t>
+      </w:r>
+      <w:r>
+        <w:rPr>
+          <w:sz w:val="22"/>
+        </w:rPr>
+        <w:t xml:space="preserve"> </w:t>
+      </w:r>
+      <w:r>
+        <w:rPr>
+          <w:sz w:val="22"/>
+        </w:rPr>
+        <w:t>(MPC),</w:t>
+      </w:r>
+      <w:r>
+        <w:rPr>
+          <w:sz w:val="22"/>
+        </w:rPr>
+        <w:t xml:space="preserve"> </w:t>
+      </w:r>
+      <w:r>
+        <w:rPr>
+          <w:sz w:val="22"/>
+        </w:rPr>
+        <w:t>Whole-Body</w:t>
+      </w:r>
+      <w:r>
+        <w:rPr>
+          <w:sz w:val="22"/>
+        </w:rPr>
+        <w:t xml:space="preserve"> </w:t>
+      </w:r>
+      <w:r>
+        <w:rPr>
+          <w:sz w:val="22"/>
+        </w:rPr>
+        <w:t>Control,</w:t>
+      </w:r>
+      <w:r>
+        <w:rPr>
+          <w:sz w:val="22"/>
+        </w:rPr>
+        <w:t xml:space="preserve"> </w:t>
+      </w:r>
+      <w:r>
+        <w:rPr>
+          <w:sz w:val="22"/>
+          <w:highlight w:val="yellow"/>
+        </w:rPr>
+        <w:t>Robot</w:t>
+      </w:r>
+      <w:r>
+        <w:rPr>
+          <w:sz w:val="22"/>
+        </w:rPr>
+        <w:t xml:space="preserve"> </w:t>
+      </w:r>
+      <w:r>
+        <w:rPr>
+          <w:sz w:val="22"/>
+          <w:highlight w:val="yellow"/>
+        </w:rPr>
+        <w:t>Dynamics,</w:t>
+      </w:r>
+      <w:r>
+        <w:rPr>
+          <w:sz w:val="22"/>
+        </w:rPr>
+        <w:t xml:space="preserve"> </w:t>
+      </w:r>
+      <w:r>
+        <w:rPr>
+          <w:sz w:val="22"/>
+        </w:rPr>
+        <w:t>State</w:t>
+      </w:r>
+      <w:r>
+        <w:rPr>
+          <w:sz w:val="22"/>
+        </w:rPr>
+        <w:t xml:space="preserve"> </w:t>
+      </w:r>
+      <w:r>
+        <w:rPr>
+          <w:sz w:val="22"/>
+        </w:rPr>
+        <w:t>Estimation</w:t>
+      </w:r>
+      <w:r>
+        <w:rPr>
+          <w:sz w:val="22"/>
+        </w:rPr>
+        <w:t xml:space="preserve"> </w:t>
+      </w:r>
+      <w:r>
+        <w:rPr>
+          <w:sz w:val="22"/>
+        </w:rPr>
+        <w:t>(Kalman</w:t>
+      </w:r>
+      <w:r>
+        <w:rPr>
+          <w:sz w:val="22"/>
+        </w:rPr>
+        <w:t xml:space="preserve"> </w:t>
+      </w:r>
+      <w:r>
+        <w:rPr>
+          <w:sz w:val="22"/>
+        </w:rPr>
+        <w:t>Filters,</w:t>
+      </w:r>
+      <w:r>
+        <w:rPr>
+          <w:sz w:val="22"/>
+        </w:rPr>
+        <w:t xml:space="preserve"> </w:t>
+      </w:r>
+      <w:r>
+        <w:rPr>
+          <w:sz w:val="22"/>
+        </w:rPr>
+        <w:t>EKF,</w:t>
+      </w:r>
+      <w:r>
+        <w:rPr>
+          <w:sz w:val="22"/>
+        </w:rPr>
+        <w:t xml:space="preserve"> </w:t>
+      </w:r>
+      <w:r>
+        <w:rPr>
+          <w:sz w:val="22"/>
+        </w:rPr>
+        <w:t>EKF2)</w:t>
       </w:r>
     </w:p>
     <w:p>
@@ -2003,6 +2403,18 @@
           <w:sz w:val="22"/>
           <w:highlight w:val="yellow"/>
         </w:rPr>
+        <w:t>Dynamics,</w:t>
+      </w:r>
+      <w:r>
+        <w:rPr>
+          <w:sz w:val="22"/>
+        </w:rPr>
+        <w:t xml:space="preserve"> </w:t>
+      </w:r>
+      <w:r>
+        <w:rPr>
+          <w:sz w:val="22"/>
+        </w:rPr>
         <w:t>Bimanual</w:t>
       </w:r>
       <w:r>
@@ -2014,9 +2426,57 @@
       <w:r>
         <w:rPr>
           <w:sz w:val="22"/>
+        </w:rPr>
+        <w:t>Manipulation,</w:t>
+      </w:r>
+      <w:r>
+        <w:rPr>
+          <w:sz w:val="22"/>
+        </w:rPr>
+        <w:t xml:space="preserve"> </w:t>
+      </w:r>
+      <w:r>
+        <w:rPr>
+          <w:sz w:val="22"/>
+        </w:rPr>
+        <w:t>Grasping,</w:t>
+      </w:r>
+      <w:r>
+        <w:rPr>
+          <w:sz w:val="22"/>
+        </w:rPr>
+        <w:t xml:space="preserve"> </w:t>
+      </w:r>
+      <w:r>
+        <w:rPr>
+          <w:sz w:val="22"/>
           <w:highlight w:val="yellow"/>
         </w:rPr>
-        <w:t>Manipulation,</w:t>
+        <w:t>Perception</w:t>
+      </w:r>
+      <w:r>
+        <w:rPr>
+          <w:sz w:val="22"/>
+        </w:rPr>
+        <w:t xml:space="preserve"> </w:t>
+      </w:r>
+      <w:r>
+        <w:rPr>
+          <w:sz w:val="22"/>
+        </w:rPr>
+        <w:t>(SLAM,</w:t>
+      </w:r>
+      <w:r>
+        <w:rPr>
+          <w:sz w:val="22"/>
+        </w:rPr>
+        <w:t xml:space="preserve"> </w:t>
+      </w:r>
+      <w:r>
+        <w:rPr>
+          <w:sz w:val="22"/>
+        </w:rPr>
+        <w:t>VIO,</w:t>
       </w:r>
       <w:r>
         <w:rPr>
@@ -2029,55 +2489,7 @@
           <w:sz w:val="22"/>
           <w:highlight w:val="yellow"/>
         </w:rPr>
-        <w:t>Grasping,</w:t>
-      </w:r>
-      <w:r>
-        <w:rPr>
-          <w:sz w:val="22"/>
-        </w:rPr>
-        <w:t xml:space="preserve"> </w:t>
-      </w:r>
-      <w:r>
-        <w:rPr>
-          <w:sz w:val="22"/>
-        </w:rPr>
-        <w:t>Computer</w:t>
-      </w:r>
-      <w:r>
-        <w:rPr>
-          <w:sz w:val="22"/>
-        </w:rPr>
-        <w:t xml:space="preserve"> </w:t>
-      </w:r>
-      <w:r>
-        <w:rPr>
-          <w:sz w:val="22"/>
-        </w:rPr>
-        <w:t>Vision</w:t>
-      </w:r>
-      <w:r>
-        <w:rPr>
-          <w:sz w:val="22"/>
-        </w:rPr>
-        <w:t xml:space="preserve"> </w:t>
-      </w:r>
-      <w:r>
-        <w:rPr>
-          <w:sz w:val="22"/>
-        </w:rPr>
-        <w:t>(SLAM,</w:t>
-      </w:r>
-      <w:r>
-        <w:rPr>
-          <w:sz w:val="22"/>
-        </w:rPr>
-        <w:t xml:space="preserve"> </w:t>
-      </w:r>
-      <w:r>
-        <w:rPr>
-          <w:sz w:val="22"/>
-        </w:rPr>
-        <w:t>VIO,</w:t>
+        <w:t>point</w:t>
       </w:r>
       <w:r>
         <w:rPr>
@@ -2090,71 +2502,6 @@
           <w:sz w:val="22"/>
           <w:highlight w:val="yellow"/>
         </w:rPr>
-        <w:t>OpenCV,</w:t>
-      </w:r>
-      <w:r>
-        <w:rPr>
-          <w:sz w:val="22"/>
-        </w:rPr>
-        <w:t xml:space="preserve"> </w:t>
-      </w:r>
-      <w:r>
-        <w:rPr>
-          <w:sz w:val="22"/>
-          <w:highlight w:val="yellow"/>
-        </w:rPr>
-        <w:t>object</w:t>
-      </w:r>
-      <w:r>
-        <w:rPr>
-          <w:sz w:val="22"/>
-        </w:rPr>
-        <w:t xml:space="preserve"> </w:t>
-      </w:r>
-      <w:r>
-        <w:rPr>
-          <w:sz w:val="22"/>
-          <w:highlight w:val="yellow"/>
-        </w:rPr>
-        <w:t>detection,</w:t>
-      </w:r>
-      <w:r>
-        <w:rPr>
-          <w:sz w:val="22"/>
-        </w:rPr>
-        <w:t xml:space="preserve"> </w:t>
-      </w:r>
-      <w:r>
-        <w:rPr>
-          <w:sz w:val="22"/>
-          <w:highlight w:val="yellow"/>
-        </w:rPr>
-        <w:t>3D</w:t>
-      </w:r>
-      <w:r>
-        <w:rPr>
-          <w:sz w:val="22"/>
-        </w:rPr>
-        <w:t xml:space="preserve"> </w:t>
-      </w:r>
-      <w:r>
-        <w:rPr>
-          <w:sz w:val="22"/>
-          <w:highlight w:val="yellow"/>
-        </w:rPr>
-        <w:t>point</w:t>
-      </w:r>
-      <w:r>
-        <w:rPr>
-          <w:sz w:val="22"/>
-        </w:rPr>
-        <w:t xml:space="preserve"> </w:t>
-      </w:r>
-      <w:r>
-        <w:rPr>
-          <w:sz w:val="22"/>
-          <w:highlight w:val="yellow"/>
-        </w:rPr>
         <w:t>clouds,</w:t>
       </w:r>
       <w:r>
@@ -2166,9 +2513,8 @@
       <w:r>
         <w:rPr>
           <w:sz w:val="22"/>
-          <w:highlight w:val="yellow"/>
-        </w:rPr>
-        <w:t>LiDAR),</w:t>
+        </w:rPr>
+        <w:t>OpenCV),</w:t>
       </w:r>
       <w:r>
         <w:rPr>
@@ -2330,7 +2676,7 @@
           <w:szCs w:val="22"/>
           <w:rtl w:val="0"/>
         </w:rPr>
-        <w:t>Programming &amp; Tools: Python, C++, PyTorch, ROS2, Isaac Sim/Isaac Lab and MuJoCo (domain randomization, sim-to-real), Firmware &amp; Embedded Systems (Arduino, Raspberry Pi, UDP/TCP, UART), Linux</w:t>
+        <w:t>Programming &amp; Tools: Python, C++, PyTorch, Distributed Training, ROS2, Isaac Sim/Isaac Lab and MuJoCo (domain randomization, sim-to-real), Firmware &amp; Embedded Systems (Arduino, Raspberry Pi, UDP/TCP, UART), Linux</w:t>
       </w:r>
     </w:p>
     <w:p>
@@ -2348,203 +2694,10 @@
       <w:r>
         <w:rPr>
           <w:sz w:val="22"/>
-        </w:rPr>
-        <w:t>Team:</w:t>
-      </w:r>
-      <w:r>
-        <w:rPr>
-          <w:sz w:val="22"/>
-        </w:rPr>
-        <w:t xml:space="preserve"> </w:t>
-      </w:r>
-      <w:r>
-        <w:rPr>
-          <w:sz w:val="22"/>
-        </w:rPr>
-        <w:t>Product</w:t>
-      </w:r>
-      <w:r>
-        <w:rPr>
-          <w:sz w:val="22"/>
-        </w:rPr>
-        <w:t xml:space="preserve"> </w:t>
-      </w:r>
-      <w:r>
-        <w:rPr>
-          <w:sz w:val="22"/>
-        </w:rPr>
-        <w:t>and</w:t>
-      </w:r>
-      <w:r>
-        <w:rPr>
-          <w:sz w:val="22"/>
-        </w:rPr>
-        <w:t xml:space="preserve"> </w:t>
-      </w:r>
-      <w:r>
-        <w:rPr>
-          <w:sz w:val="22"/>
-        </w:rPr>
-        <w:t>Project</w:t>
-      </w:r>
-      <w:r>
-        <w:rPr>
-          <w:sz w:val="22"/>
-        </w:rPr>
-        <w:t xml:space="preserve"> </w:t>
-      </w:r>
-      <w:r>
-        <w:rPr>
-          <w:sz w:val="22"/>
-        </w:rPr>
-        <w:t>Management;</w:t>
-      </w:r>
-      <w:r>
-        <w:rPr>
-          <w:sz w:val="22"/>
-        </w:rPr>
-        <w:t xml:space="preserve"> </w:t>
-      </w:r>
-      <w:r>
-        <w:rPr>
-          <w:sz w:val="22"/>
-        </w:rPr>
-        <w:t>Technical</w:t>
-      </w:r>
-      <w:r>
-        <w:rPr>
-          <w:sz w:val="22"/>
-        </w:rPr>
-        <w:t xml:space="preserve"> </w:t>
-      </w:r>
-      <w:r>
-        <w:rPr>
-          <w:sz w:val="22"/>
-        </w:rPr>
-        <w:t>Leadership;</w:t>
-      </w:r>
-      <w:r>
-        <w:rPr>
-          <w:sz w:val="22"/>
-        </w:rPr>
-        <w:t xml:space="preserve"> </w:t>
-      </w:r>
-      <w:r>
-        <w:rPr>
-          <w:sz w:val="22"/>
-        </w:rPr>
-        <w:t>Team</w:t>
-      </w:r>
-      <w:r>
-        <w:rPr>
-          <w:sz w:val="22"/>
-        </w:rPr>
-        <w:t xml:space="preserve"> </w:t>
-      </w:r>
-      <w:r>
-        <w:rPr>
-          <w:sz w:val="22"/>
-        </w:rPr>
-        <w:t>Building</w:t>
-      </w:r>
-      <w:r>
-        <w:rPr>
-          <w:sz w:val="22"/>
-        </w:rPr>
-        <w:t xml:space="preserve"> </w:t>
-      </w:r>
-      <w:r>
-        <w:rPr>
-          <w:sz w:val="22"/>
-        </w:rPr>
-        <w:t>and</w:t>
-      </w:r>
-      <w:r>
-        <w:rPr>
-          <w:sz w:val="22"/>
-        </w:rPr>
-        <w:t xml:space="preserve"> </w:t>
-      </w:r>
-      <w:r>
-        <w:rPr>
-          <w:sz w:val="22"/>
-        </w:rPr>
-        <w:t>Hiring;</w:t>
-      </w:r>
-      <w:r>
-        <w:rPr>
-          <w:sz w:val="22"/>
-        </w:rPr>
-        <w:t xml:space="preserve"> </w:t>
-      </w:r>
-      <w:r>
-        <w:rPr>
-          <w:sz w:val="22"/>
-        </w:rPr>
-        <w:t>Technical</w:t>
-      </w:r>
-      <w:r>
-        <w:rPr>
-          <w:sz w:val="22"/>
-        </w:rPr>
-        <w:t xml:space="preserve"> </w:t>
-      </w:r>
-      <w:r>
-        <w:rPr>
-          <w:sz w:val="22"/>
-        </w:rPr>
-        <w:t>Communication</w:t>
-      </w:r>
-      <w:r>
-        <w:rPr>
-          <w:sz w:val="22"/>
-        </w:rPr>
-        <w:t xml:space="preserve"> </w:t>
-      </w:r>
-      <w:r>
-        <w:rPr>
-          <w:sz w:val="22"/>
-        </w:rPr>
-        <w:t>and</w:t>
-      </w:r>
-      <w:r>
-        <w:rPr>
-          <w:sz w:val="22"/>
-        </w:rPr>
-        <w:t xml:space="preserve"> </w:t>
-      </w:r>
-      <w:r>
-        <w:rPr>
-          <w:sz w:val="22"/>
-          <w:highlight w:val="yellow"/>
-        </w:rPr>
-        <w:t>Presentations;</w:t>
-      </w:r>
-      <w:r>
-        <w:rPr>
-          <w:sz w:val="22"/>
-        </w:rPr>
-        <w:t xml:space="preserve"> </w:t>
-      </w:r>
-      <w:r>
-        <w:rPr>
-          <w:sz w:val="22"/>
-          <w:highlight w:val="yellow"/>
-        </w:rPr>
-        <w:t>Cross-Functional</w:t>
-      </w:r>
-      <w:r>
-        <w:rPr>
-          <w:sz w:val="22"/>
-        </w:rPr>
-        <w:t xml:space="preserve"> </w:t>
-      </w:r>
-      <w:r>
-        <w:rPr>
-          <w:sz w:val="22"/>
-          <w:highlight w:val="yellow"/>
-        </w:rPr>
-        <w:t>Collaboration</w:t>
+          <w:szCs w:val="22"/>
+          <w:rtl w:val="0"/>
+        </w:rPr>
+        <w:t xml:space="preserve">Team: Product and Project Management; Technical Leadership; Team Building and Hiring; Technical Communication and Presentations</w:t>
       </w:r>
     </w:p>
     <w:p>

</xml_diff>

<commit_message>
Archive previous Skild AI applications and add new Robotics Engineer Manipulation job description with updated resume
</commit_message>
<xml_diff>
--- a/Applications/20260412_Skild_AI_Application_Robotics_Engineer_Manipulation/Alexander-Nettekoven-Resume-Skild-AI-Robotics-Engineer-Manipulation.docx
+++ b/Applications/20260412_Skild_AI_Application_Robotics_Engineer_Manipulation/Alexander-Nettekoven-Resume-Skild-AI-Robotics-Engineer-Manipulation.docx
@@ -174,635 +174,15 @@
       <w:r>
         <w:rPr>
           <w:sz w:val="22"/>
-        </w:rPr>
-        <w:t>Robotics</w:t>
-      </w:r>
-      <w:r>
-        <w:rPr>
-          <w:sz w:val="22"/>
-        </w:rPr>
-        <w:t xml:space="preserve"> </w:t>
-      </w:r>
-      <w:r>
-        <w:rPr>
-          <w:sz w:val="22"/>
-        </w:rPr>
-        <w:t>researcher</w:t>
-      </w:r>
-      <w:r>
-        <w:rPr>
-          <w:sz w:val="22"/>
-        </w:rPr>
-        <w:t xml:space="preserve"> </w:t>
-      </w:r>
-      <w:r>
-        <w:rPr>
-          <w:sz w:val="22"/>
-        </w:rPr>
-        <w:t>and</w:t>
-      </w:r>
-      <w:r>
-        <w:rPr>
-          <w:sz w:val="22"/>
-        </w:rPr>
-        <w:t xml:space="preserve"> </w:t>
-      </w:r>
-      <w:r>
-        <w:rPr>
-          <w:sz w:val="22"/>
-        </w:rPr>
-        <w:t>engineer</w:t>
-      </w:r>
-      <w:r>
-        <w:rPr>
-          <w:sz w:val="22"/>
-        </w:rPr>
-        <w:t xml:space="preserve"> </w:t>
-      </w:r>
-      <w:r>
-        <w:rPr>
-          <w:sz w:val="22"/>
-        </w:rPr>
-        <w:t>applying</w:t>
-      </w:r>
-      <w:r>
-        <w:rPr>
-          <w:sz w:val="22"/>
-        </w:rPr>
-        <w:t xml:space="preserve"> </w:t>
-      </w:r>
-      <w:r>
-        <w:rPr>
-          <w:sz w:val="22"/>
-        </w:rPr>
-        <w:t>for</w:t>
-      </w:r>
-      <w:r>
-        <w:rPr>
-          <w:sz w:val="22"/>
-        </w:rPr>
-        <w:t xml:space="preserve"> </w:t>
-      </w:r>
-      <w:r>
-        <w:rPr>
-          <w:sz w:val="22"/>
-          <w:highlight w:val="yellow"/>
-        </w:rPr>
-        <w:t>Robotics</w:t>
-      </w:r>
-      <w:r>
-        <w:rPr>
-          <w:sz w:val="22"/>
-        </w:rPr>
-        <w:t xml:space="preserve"> </w:t>
-      </w:r>
-      <w:r>
-        <w:rPr>
-          <w:sz w:val="22"/>
-          <w:highlight w:val="yellow"/>
-        </w:rPr>
-        <w:t>Engineer,</w:t>
-      </w:r>
-      <w:r>
-        <w:rPr>
-          <w:sz w:val="22"/>
-        </w:rPr>
-        <w:t xml:space="preserve"> </w:t>
-      </w:r>
-      <w:r>
-        <w:rPr>
-          <w:sz w:val="22"/>
-          <w:highlight w:val="yellow"/>
-        </w:rPr>
-        <w:t>Manipulation</w:t>
-      </w:r>
-      <w:r>
-        <w:rPr>
-          <w:sz w:val="22"/>
-        </w:rPr>
-        <w:t xml:space="preserve"> </w:t>
-      </w:r>
-      <w:r>
-        <w:rPr>
-          <w:sz w:val="22"/>
-        </w:rPr>
-        <w:t>at</w:t>
-      </w:r>
-      <w:r>
-        <w:rPr>
-          <w:sz w:val="22"/>
-        </w:rPr>
-        <w:t xml:space="preserve"> </w:t>
-      </w:r>
-      <w:r>
-        <w:rPr>
-          <w:sz w:val="22"/>
-          <w:highlight w:val="yellow"/>
-        </w:rPr>
-        <w:t>Skild</w:t>
-      </w:r>
-      <w:r>
-        <w:rPr>
-          <w:sz w:val="22"/>
-        </w:rPr>
-        <w:t xml:space="preserve"> </w:t>
-      </w:r>
-      <w:r>
-        <w:rPr>
-          <w:sz w:val="22"/>
-          <w:highlight w:val="yellow"/>
-        </w:rPr>
-        <w:t>AI.</w:t>
-      </w:r>
-      <w:r>
-        <w:rPr>
-          <w:sz w:val="22"/>
-        </w:rPr>
-        <w:t xml:space="preserve"> </w:t>
-      </w:r>
-      <w:r>
-        <w:rPr>
-          <w:sz w:val="22"/>
-        </w:rPr>
-        <w:t>I</w:t>
-      </w:r>
-      <w:r>
-        <w:rPr>
-          <w:sz w:val="22"/>
-        </w:rPr>
-        <w:t xml:space="preserve"> </w:t>
-      </w:r>
-      <w:r>
-        <w:rPr>
-          <w:sz w:val="22"/>
-        </w:rPr>
-        <w:t>specialize</w:t>
-      </w:r>
-      <w:r>
-        <w:rPr>
-          <w:sz w:val="22"/>
-        </w:rPr>
-        <w:t xml:space="preserve"> </w:t>
-      </w:r>
-      <w:r>
-        <w:rPr>
-          <w:sz w:val="22"/>
-        </w:rPr>
-        <w:t>in</w:t>
-      </w:r>
-      <w:r>
-        <w:rPr>
-          <w:sz w:val="22"/>
-        </w:rPr>
-        <w:t xml:space="preserve"> </w:t>
-      </w:r>
-      <w:r>
-        <w:rPr>
-          <w:sz w:val="22"/>
-        </w:rPr>
-        <w:t>reinforcement</w:t>
-      </w:r>
-      <w:r>
-        <w:rPr>
-          <w:sz w:val="22"/>
-        </w:rPr>
-        <w:t xml:space="preserve"> </w:t>
-      </w:r>
-      <w:r>
-        <w:rPr>
-          <w:sz w:val="22"/>
-        </w:rPr>
-        <w:t>learning,</w:t>
-      </w:r>
-      <w:r>
-        <w:rPr>
-          <w:sz w:val="22"/>
-        </w:rPr>
-        <w:t xml:space="preserve"> </w:t>
-      </w:r>
-      <w:r>
-        <w:rPr>
-          <w:sz w:val="22"/>
-        </w:rPr>
-        <w:t>sim-to-real</w:t>
-      </w:r>
-      <w:r>
-        <w:rPr>
-          <w:sz w:val="22"/>
-        </w:rPr>
-        <w:t xml:space="preserve"> </w:t>
-      </w:r>
-      <w:r>
-        <w:rPr>
-          <w:sz w:val="22"/>
-        </w:rPr>
-        <w:t>transfer,</w:t>
-      </w:r>
-      <w:r>
-        <w:rPr>
-          <w:sz w:val="22"/>
-        </w:rPr>
-        <w:t xml:space="preserve"> </w:t>
-      </w:r>
-      <w:r>
-        <w:rPr>
-          <w:sz w:val="22"/>
-        </w:rPr>
-        <w:t>and</w:t>
-      </w:r>
-      <w:r>
-        <w:rPr>
-          <w:sz w:val="22"/>
-        </w:rPr>
-        <w:t xml:space="preserve"> </w:t>
-      </w:r>
-      <w:r>
-        <w:rPr>
-          <w:sz w:val="22"/>
-        </w:rPr>
-        <w:t>whole-body</w:t>
-      </w:r>
-      <w:r>
-        <w:rPr>
-          <w:sz w:val="22"/>
-        </w:rPr>
-        <w:t xml:space="preserve"> </w:t>
-      </w:r>
-      <w:r>
-        <w:rPr>
-          <w:sz w:val="22"/>
-        </w:rPr>
-        <w:t>control</w:t>
-      </w:r>
-      <w:r>
-        <w:rPr>
-          <w:sz w:val="22"/>
-        </w:rPr>
-        <w:t xml:space="preserve"> </w:t>
-      </w:r>
-      <w:r>
-        <w:rPr>
-          <w:sz w:val="22"/>
-        </w:rPr>
-        <w:t>for</w:t>
-      </w:r>
-      <w:r>
-        <w:rPr>
-          <w:sz w:val="22"/>
-        </w:rPr>
-        <w:t xml:space="preserve"> </w:t>
-      </w:r>
-      <w:r>
-        <w:rPr>
-          <w:sz w:val="22"/>
-        </w:rPr>
-        <w:t>humanoid</w:t>
-      </w:r>
-      <w:r>
-        <w:rPr>
-          <w:sz w:val="22"/>
-        </w:rPr>
-        <w:t xml:space="preserve"> </w:t>
-      </w:r>
-      <w:r>
-        <w:rPr>
-          <w:sz w:val="22"/>
-        </w:rPr>
-        <w:t>/</w:t>
-      </w:r>
-      <w:r>
-        <w:rPr>
-          <w:sz w:val="22"/>
-        </w:rPr>
-        <w:t xml:space="preserve"> </w:t>
-      </w:r>
-      <w:r>
-        <w:rPr>
-          <w:sz w:val="22"/>
-        </w:rPr>
-        <w:t>semi-humanoid</w:t>
-      </w:r>
-      <w:r>
-        <w:rPr>
-          <w:sz w:val="22"/>
-        </w:rPr>
-        <w:t xml:space="preserve"> </w:t>
-      </w:r>
-      <w:r>
-        <w:rPr>
-          <w:sz w:val="22"/>
-        </w:rPr>
-        <w:t>locomotion</w:t>
-      </w:r>
-      <w:r>
-        <w:rPr>
-          <w:sz w:val="22"/>
-        </w:rPr>
-        <w:t xml:space="preserve"> </w:t>
-      </w:r>
-      <w:r>
-        <w:rPr>
-          <w:sz w:val="22"/>
-        </w:rPr>
-        <w:t>and</w:t>
-      </w:r>
-      <w:r>
-        <w:rPr>
-          <w:sz w:val="22"/>
-        </w:rPr>
-        <w:t xml:space="preserve"> </w:t>
-      </w:r>
-      <w:r>
-        <w:rPr>
-          <w:sz w:val="22"/>
-        </w:rPr>
-        <w:t>manipulation.</w:t>
-      </w:r>
-      <w:r>
-        <w:rPr>
-          <w:sz w:val="22"/>
-        </w:rPr>
-        <w:t xml:space="preserve"> </w:t>
-      </w:r>
-      <w:r>
-        <w:rPr>
-          <w:sz w:val="22"/>
-        </w:rPr>
-        <w:t>5+</w:t>
-      </w:r>
-      <w:r>
-        <w:rPr>
-          <w:sz w:val="22"/>
-        </w:rPr>
-        <w:t xml:space="preserve"> </w:t>
-      </w:r>
-      <w:r>
-        <w:rPr>
-          <w:sz w:val="22"/>
-        </w:rPr>
-        <w:t>years</w:t>
-      </w:r>
-      <w:r>
-        <w:rPr>
-          <w:sz w:val="22"/>
-        </w:rPr>
-        <w:t xml:space="preserve"> </w:t>
-      </w:r>
-      <w:r>
-        <w:rPr>
-          <w:sz w:val="22"/>
-        </w:rPr>
-        <w:t>building</w:t>
-      </w:r>
-      <w:r>
-        <w:rPr>
-          <w:sz w:val="22"/>
-        </w:rPr>
-        <w:t xml:space="preserve"> </w:t>
-      </w:r>
-      <w:r>
-        <w:rPr>
-          <w:sz w:val="22"/>
-        </w:rPr>
-        <w:t>novel</w:t>
-      </w:r>
-      <w:r>
-        <w:rPr>
-          <w:sz w:val="22"/>
-        </w:rPr>
-        <w:t xml:space="preserve"> </w:t>
-      </w:r>
-      <w:r>
-        <w:rPr>
-          <w:sz w:val="22"/>
-        </w:rPr>
-        <w:t>robotic</w:t>
-      </w:r>
-      <w:r>
-        <w:rPr>
-          <w:sz w:val="22"/>
-        </w:rPr>
-        <w:t xml:space="preserve"> </w:t>
-      </w:r>
-      <w:r>
-        <w:rPr>
-          <w:sz w:val="22"/>
-        </w:rPr>
-        <w:t>systems</w:t>
-      </w:r>
-      <w:r>
-        <w:rPr>
-          <w:sz w:val="22"/>
-        </w:rPr>
-        <w:t xml:space="preserve"> </w:t>
-      </w:r>
-      <w:r>
-        <w:rPr>
-          <w:sz w:val="22"/>
-        </w:rPr>
-        <w:t>and</w:t>
-      </w:r>
-      <w:r>
-        <w:rPr>
-          <w:sz w:val="22"/>
-        </w:rPr>
-        <w:t xml:space="preserve"> </w:t>
-      </w:r>
-      <w:r>
-        <w:rPr>
-          <w:sz w:val="22"/>
-          <w:highlight w:val="yellow"/>
-        </w:rPr>
-        <w:t>deploying</w:t>
-      </w:r>
-      <w:r>
-        <w:rPr>
-          <w:sz w:val="22"/>
-        </w:rPr>
-        <w:t xml:space="preserve"> </w:t>
-      </w:r>
-      <w:r>
-        <w:rPr>
-          <w:sz w:val="22"/>
-          <w:highlight w:val="yellow"/>
-        </w:rPr>
-        <w:t>production-level</w:t>
-      </w:r>
-      <w:r>
-        <w:rPr>
-          <w:sz w:val="22"/>
-        </w:rPr>
-        <w:t xml:space="preserve"> </w:t>
-      </w:r>
-      <w:r>
-        <w:rPr>
-          <w:sz w:val="22"/>
-        </w:rPr>
-        <w:t>robot</w:t>
-      </w:r>
-      <w:r>
-        <w:rPr>
-          <w:sz w:val="22"/>
-        </w:rPr>
-        <w:t xml:space="preserve"> </w:t>
-      </w:r>
-      <w:r>
-        <w:rPr>
-          <w:sz w:val="22"/>
-        </w:rPr>
-        <w:t>learning</w:t>
-      </w:r>
-      <w:r>
-        <w:rPr>
-          <w:sz w:val="22"/>
-        </w:rPr>
-        <w:t xml:space="preserve"> </w:t>
-      </w:r>
-      <w:r>
-        <w:rPr>
-          <w:sz w:val="22"/>
-        </w:rPr>
-        <w:t>algorithms</w:t>
-      </w:r>
-      <w:r>
-        <w:rPr>
-          <w:sz w:val="22"/>
-        </w:rPr>
-        <w:t xml:space="preserve"> </w:t>
-      </w:r>
-      <w:r>
-        <w:rPr>
-          <w:sz w:val="22"/>
-          <w:highlight w:val="yellow"/>
-        </w:rPr>
-        <w:t>with</w:t>
-      </w:r>
-      <w:r>
-        <w:rPr>
-          <w:sz w:val="22"/>
-        </w:rPr>
-        <w:t xml:space="preserve"> </w:t>
-      </w:r>
-      <w:r>
-        <w:rPr>
-          <w:sz w:val="22"/>
-          <w:highlight w:val="yellow"/>
-        </w:rPr>
-        <w:t>expertise</w:t>
-      </w:r>
-      <w:r>
-        <w:rPr>
-          <w:sz w:val="22"/>
-        </w:rPr>
-        <w:t xml:space="preserve"> </w:t>
-      </w:r>
-      <w:r>
-        <w:rPr>
-          <w:sz w:val="22"/>
-          <w:highlight w:val="yellow"/>
-        </w:rPr>
-        <w:t>in</w:t>
-      </w:r>
-      <w:r>
-        <w:rPr>
-          <w:sz w:val="22"/>
-        </w:rPr>
-        <w:t xml:space="preserve"> </w:t>
-      </w:r>
-      <w:r>
-        <w:rPr>
-          <w:sz w:val="22"/>
-          <w:highlight w:val="yellow"/>
-        </w:rPr>
-        <w:t>controls,</w:t>
-      </w:r>
-      <w:r>
-        <w:rPr>
-          <w:sz w:val="22"/>
-        </w:rPr>
-        <w:t xml:space="preserve"> </w:t>
-      </w:r>
-      <w:r>
-        <w:rPr>
-          <w:sz w:val="22"/>
-          <w:highlight w:val="yellow"/>
-        </w:rPr>
-        <w:t>perception,</w:t>
-      </w:r>
-      <w:r>
-        <w:rPr>
-          <w:sz w:val="22"/>
-        </w:rPr>
-        <w:t xml:space="preserve"> </w:t>
-      </w:r>
-      <w:r>
-        <w:rPr>
-          <w:sz w:val="22"/>
-          <w:highlight w:val="yellow"/>
-        </w:rPr>
-        <w:t>and</w:t>
-      </w:r>
-      <w:r>
-        <w:rPr>
-          <w:sz w:val="22"/>
-        </w:rPr>
-        <w:t xml:space="preserve"> </w:t>
-      </w:r>
-      <w:r>
-        <w:rPr>
-          <w:sz w:val="22"/>
-          <w:highlight w:val="yellow"/>
-        </w:rPr>
-        <w:t>motion</w:t>
-      </w:r>
-      <w:r>
-        <w:rPr>
-          <w:sz w:val="22"/>
-        </w:rPr>
-        <w:t xml:space="preserve"> </w:t>
-      </w:r>
-      <w:r>
-        <w:rPr>
-          <w:sz w:val="22"/>
-          <w:highlight w:val="yellow"/>
-        </w:rPr>
-        <w:t>planning</w:t>
-      </w:r>
-      <w:r>
-        <w:rPr>
-          <w:sz w:val="22"/>
-        </w:rPr>
-        <w:t xml:space="preserve"> </w:t>
-      </w:r>
-      <w:r>
-        <w:rPr>
-          <w:sz w:val="22"/>
-        </w:rPr>
-        <w:t>for</w:t>
-      </w:r>
-      <w:r>
-        <w:rPr>
-          <w:sz w:val="22"/>
-        </w:rPr>
-        <w:t xml:space="preserve"> </w:t>
-      </w:r>
-      <w:r>
-        <w:rPr>
-          <w:sz w:val="22"/>
-        </w:rPr>
-        <w:t>real-world</w:t>
-      </w:r>
-      <w:r>
-        <w:rPr>
-          <w:sz w:val="22"/>
-        </w:rPr>
-        <w:t xml:space="preserve"> </w:t>
-      </w:r>
-      <w:r>
-        <w:rPr>
-          <w:sz w:val="22"/>
-        </w:rPr>
-        <w:t>environments.</w:t>
+          <w:szCs w:val="22"/>
+          <w:rtl w:val="0"/>
+        </w:rPr>
+        <w:t>Robotics researcher and engineer applying for [job title] at [company]. I specialize in reinforcement learning, sim-to-real transfer, and whole-body control for humanoid / semi-humanoid locomotion and manipulation. 5+ years building novel robotic systems and robot learning algorithms for real-world environments.</w:t>
+      </w:r>
+      <w:r>
+        <w:rPr>
+          <w:rtl w:val="0"/>
+        </w:rPr>
       </w:r>
     </w:p>
     <w:p>
@@ -2068,274 +1448,10 @@
       <w:r>
         <w:rPr>
           <w:sz w:val="22"/>
-        </w:rPr>
-        <w:t>Control:</w:t>
-      </w:r>
-      <w:r>
-        <w:rPr>
-          <w:sz w:val="22"/>
-        </w:rPr>
-        <w:t xml:space="preserve"> </w:t>
-      </w:r>
-      <w:r>
-        <w:rPr>
-          <w:sz w:val="22"/>
-        </w:rPr>
-        <w:t>Real-Time</w:t>
-      </w:r>
-      <w:r>
-        <w:rPr>
-          <w:sz w:val="22"/>
-        </w:rPr>
-        <w:t xml:space="preserve"> </w:t>
-      </w:r>
-      <w:r>
-        <w:rPr>
-          <w:sz w:val="22"/>
-        </w:rPr>
-        <w:t>Feedback</w:t>
-      </w:r>
-      <w:r>
-        <w:rPr>
-          <w:sz w:val="22"/>
-        </w:rPr>
-        <w:t xml:space="preserve"> </w:t>
-      </w:r>
-      <w:r>
-        <w:rPr>
-          <w:sz w:val="22"/>
-        </w:rPr>
-        <w:t>Control</w:t>
-      </w:r>
-      <w:r>
-        <w:rPr>
-          <w:sz w:val="22"/>
-        </w:rPr>
-        <w:t xml:space="preserve"> </w:t>
-      </w:r>
-      <w:r>
-        <w:rPr>
-          <w:sz w:val="22"/>
-        </w:rPr>
-        <w:t>(Optimal</w:t>
-      </w:r>
-      <w:r>
-        <w:rPr>
-          <w:sz w:val="22"/>
-        </w:rPr>
-        <w:t xml:space="preserve"> </w:t>
-      </w:r>
-      <w:r>
-        <w:rPr>
-          <w:sz w:val="22"/>
-        </w:rPr>
-        <w:t>Control,</w:t>
-      </w:r>
-      <w:r>
-        <w:rPr>
-          <w:sz w:val="22"/>
-        </w:rPr>
-        <w:t xml:space="preserve"> </w:t>
-      </w:r>
-      <w:r>
-        <w:rPr>
-          <w:sz w:val="22"/>
-        </w:rPr>
-        <w:t>Nonlinear</w:t>
-      </w:r>
-      <w:r>
-        <w:rPr>
-          <w:sz w:val="22"/>
-        </w:rPr>
-        <w:t xml:space="preserve"> </w:t>
-      </w:r>
-      <w:r>
-        <w:rPr>
-          <w:sz w:val="22"/>
-        </w:rPr>
-        <w:t>Control,</w:t>
-      </w:r>
-      <w:r>
-        <w:rPr>
-          <w:sz w:val="22"/>
-        </w:rPr>
-        <w:t xml:space="preserve"> </w:t>
-      </w:r>
-      <w:r>
-        <w:rPr>
-          <w:sz w:val="22"/>
-        </w:rPr>
-        <w:t>PID),</w:t>
-      </w:r>
-      <w:r>
-        <w:rPr>
-          <w:sz w:val="22"/>
-        </w:rPr>
-        <w:t xml:space="preserve"> </w:t>
-      </w:r>
-      <w:r>
-        <w:rPr>
-          <w:sz w:val="22"/>
-        </w:rPr>
-        <w:t>Model</w:t>
-      </w:r>
-      <w:r>
-        <w:rPr>
-          <w:sz w:val="22"/>
-        </w:rPr>
-        <w:t xml:space="preserve"> </w:t>
-      </w:r>
-      <w:r>
-        <w:rPr>
-          <w:sz w:val="22"/>
-        </w:rPr>
-        <w:t>Predictive</w:t>
-      </w:r>
-      <w:r>
-        <w:rPr>
-          <w:sz w:val="22"/>
-        </w:rPr>
-        <w:t xml:space="preserve"> </w:t>
-      </w:r>
-      <w:r>
-        <w:rPr>
-          <w:sz w:val="22"/>
-        </w:rPr>
-        <w:t>Control</w:t>
-      </w:r>
-      <w:r>
-        <w:rPr>
-          <w:sz w:val="22"/>
-        </w:rPr>
-        <w:t xml:space="preserve"> </w:t>
-      </w:r>
-      <w:r>
-        <w:rPr>
-          <w:sz w:val="22"/>
-        </w:rPr>
-        <w:t>(MPC),</w:t>
-      </w:r>
-      <w:r>
-        <w:rPr>
-          <w:sz w:val="22"/>
-        </w:rPr>
-        <w:t xml:space="preserve"> </w:t>
-      </w:r>
-      <w:r>
-        <w:rPr>
-          <w:sz w:val="22"/>
-        </w:rPr>
-        <w:t>Whole-Body</w:t>
-      </w:r>
-      <w:r>
-        <w:rPr>
-          <w:sz w:val="22"/>
-        </w:rPr>
-        <w:t xml:space="preserve"> </w:t>
-      </w:r>
-      <w:r>
-        <w:rPr>
-          <w:sz w:val="22"/>
-        </w:rPr>
-        <w:t>Control,</w:t>
-      </w:r>
-      <w:r>
-        <w:rPr>
-          <w:sz w:val="22"/>
-        </w:rPr>
-        <w:t xml:space="preserve"> </w:t>
-      </w:r>
-      <w:r>
-        <w:rPr>
-          <w:sz w:val="22"/>
-          <w:highlight w:val="yellow"/>
-        </w:rPr>
-        <w:t>Robot</w:t>
-      </w:r>
-      <w:r>
-        <w:rPr>
-          <w:sz w:val="22"/>
-        </w:rPr>
-        <w:t xml:space="preserve"> </w:t>
-      </w:r>
-      <w:r>
-        <w:rPr>
-          <w:sz w:val="22"/>
-          <w:highlight w:val="yellow"/>
-        </w:rPr>
-        <w:t>Dynamics,</w:t>
-      </w:r>
-      <w:r>
-        <w:rPr>
-          <w:sz w:val="22"/>
-        </w:rPr>
-        <w:t xml:space="preserve"> </w:t>
-      </w:r>
-      <w:r>
-        <w:rPr>
-          <w:sz w:val="22"/>
-        </w:rPr>
-        <w:t>State</w:t>
-      </w:r>
-      <w:r>
-        <w:rPr>
-          <w:sz w:val="22"/>
-        </w:rPr>
-        <w:t xml:space="preserve"> </w:t>
-      </w:r>
-      <w:r>
-        <w:rPr>
-          <w:sz w:val="22"/>
-        </w:rPr>
-        <w:t>Estimation</w:t>
-      </w:r>
-      <w:r>
-        <w:rPr>
-          <w:sz w:val="22"/>
-        </w:rPr>
-        <w:t xml:space="preserve"> </w:t>
-      </w:r>
-      <w:r>
-        <w:rPr>
-          <w:sz w:val="22"/>
-        </w:rPr>
-        <w:t>(Kalman</w:t>
-      </w:r>
-      <w:r>
-        <w:rPr>
-          <w:sz w:val="22"/>
-        </w:rPr>
-        <w:t xml:space="preserve"> </w:t>
-      </w:r>
-      <w:r>
-        <w:rPr>
-          <w:sz w:val="22"/>
-        </w:rPr>
-        <w:t>Filters,</w:t>
-      </w:r>
-      <w:r>
-        <w:rPr>
-          <w:sz w:val="22"/>
-        </w:rPr>
-        <w:t xml:space="preserve"> </w:t>
-      </w:r>
-      <w:r>
-        <w:rPr>
-          <w:sz w:val="22"/>
-        </w:rPr>
-        <w:t>EKF,</w:t>
-      </w:r>
-      <w:r>
-        <w:rPr>
-          <w:sz w:val="22"/>
-        </w:rPr>
-        <w:t xml:space="preserve"> </w:t>
-      </w:r>
-      <w:r>
-        <w:rPr>
-          <w:sz w:val="22"/>
-        </w:rPr>
-        <w:t>EKF2)</w:t>
+          <w:szCs w:val="22"/>
+          <w:rtl w:val="0"/>
+        </w:rPr>
+        <w:t>Control: Real-Time Feedback Control (Optimal Control, Nonlinear Control, PID), Model Predictive Control (MPC), Whole-Body Control, State Estimation (Kalman Filters, EKF, EKF2)</w:t>
       </w:r>
     </w:p>
     <w:p>
@@ -2353,288 +1469,10 @@
       <w:r>
         <w:rPr>
           <w:sz w:val="22"/>
-        </w:rPr>
-        <w:t>Robotics:</w:t>
-      </w:r>
-      <w:r>
-        <w:rPr>
-          <w:sz w:val="22"/>
-        </w:rPr>
-        <w:t xml:space="preserve"> </w:t>
-      </w:r>
-      <w:r>
-        <w:rPr>
-          <w:sz w:val="22"/>
-        </w:rPr>
-        <w:t>Kinematics</w:t>
-      </w:r>
-      <w:r>
-        <w:rPr>
-          <w:sz w:val="22"/>
-        </w:rPr>
-        <w:t xml:space="preserve"> </w:t>
-      </w:r>
-      <w:r>
-        <w:rPr>
-          <w:sz w:val="22"/>
-        </w:rPr>
-        <w:t>(forward,</w:t>
-      </w:r>
-      <w:r>
-        <w:rPr>
-          <w:sz w:val="22"/>
-        </w:rPr>
-        <w:t xml:space="preserve"> </w:t>
-      </w:r>
-      <w:r>
-        <w:rPr>
-          <w:sz w:val="22"/>
-        </w:rPr>
-        <w:t>inverse),</w:t>
-      </w:r>
-      <w:r>
-        <w:rPr>
-          <w:sz w:val="22"/>
-        </w:rPr>
-        <w:t xml:space="preserve"> </w:t>
-      </w:r>
-      <w:r>
-        <w:rPr>
-          <w:sz w:val="22"/>
-          <w:highlight w:val="yellow"/>
-        </w:rPr>
-        <w:t>Dynamics,</w:t>
-      </w:r>
-      <w:r>
-        <w:rPr>
-          <w:sz w:val="22"/>
-        </w:rPr>
-        <w:t xml:space="preserve"> </w:t>
-      </w:r>
-      <w:r>
-        <w:rPr>
-          <w:sz w:val="22"/>
-        </w:rPr>
-        <w:t>Bimanual</w:t>
-      </w:r>
-      <w:r>
-        <w:rPr>
-          <w:sz w:val="22"/>
-        </w:rPr>
-        <w:t xml:space="preserve"> </w:t>
-      </w:r>
-      <w:r>
-        <w:rPr>
-          <w:sz w:val="22"/>
-        </w:rPr>
-        <w:t>Manipulation,</w:t>
-      </w:r>
-      <w:r>
-        <w:rPr>
-          <w:sz w:val="22"/>
-        </w:rPr>
-        <w:t xml:space="preserve"> </w:t>
-      </w:r>
-      <w:r>
-        <w:rPr>
-          <w:sz w:val="22"/>
-        </w:rPr>
-        <w:t>Grasping,</w:t>
-      </w:r>
-      <w:r>
-        <w:rPr>
-          <w:sz w:val="22"/>
-        </w:rPr>
-        <w:t xml:space="preserve"> </w:t>
-      </w:r>
-      <w:r>
-        <w:rPr>
-          <w:sz w:val="22"/>
-          <w:highlight w:val="yellow"/>
-        </w:rPr>
-        <w:t>Perception</w:t>
-      </w:r>
-      <w:r>
-        <w:rPr>
-          <w:sz w:val="22"/>
-        </w:rPr>
-        <w:t xml:space="preserve"> </w:t>
-      </w:r>
-      <w:r>
-        <w:rPr>
-          <w:sz w:val="22"/>
-        </w:rPr>
-        <w:t>(SLAM,</w:t>
-      </w:r>
-      <w:r>
-        <w:rPr>
-          <w:sz w:val="22"/>
-        </w:rPr>
-        <w:t xml:space="preserve"> </w:t>
-      </w:r>
-      <w:r>
-        <w:rPr>
-          <w:sz w:val="22"/>
-        </w:rPr>
-        <w:t>VIO,</w:t>
-      </w:r>
-      <w:r>
-        <w:rPr>
-          <w:sz w:val="22"/>
-        </w:rPr>
-        <w:t xml:space="preserve"> </w:t>
-      </w:r>
-      <w:r>
-        <w:rPr>
-          <w:sz w:val="22"/>
-          <w:highlight w:val="yellow"/>
-        </w:rPr>
-        <w:t>point</w:t>
-      </w:r>
-      <w:r>
-        <w:rPr>
-          <w:sz w:val="22"/>
-        </w:rPr>
-        <w:t xml:space="preserve"> </w:t>
-      </w:r>
-      <w:r>
-        <w:rPr>
-          <w:sz w:val="22"/>
-          <w:highlight w:val="yellow"/>
-        </w:rPr>
-        <w:t>clouds,</w:t>
-      </w:r>
-      <w:r>
-        <w:rPr>
-          <w:sz w:val="22"/>
-        </w:rPr>
-        <w:t xml:space="preserve"> </w:t>
-      </w:r>
-      <w:r>
-        <w:rPr>
-          <w:sz w:val="22"/>
-        </w:rPr>
-        <w:t>OpenCV),</w:t>
-      </w:r>
-      <w:r>
-        <w:rPr>
-          <w:sz w:val="22"/>
-        </w:rPr>
-        <w:t xml:space="preserve"> </w:t>
-      </w:r>
-      <w:r>
-        <w:rPr>
-          <w:sz w:val="22"/>
-        </w:rPr>
-        <w:t>Tactile</w:t>
-      </w:r>
-      <w:r>
-        <w:rPr>
-          <w:sz w:val="22"/>
-        </w:rPr>
-        <w:t xml:space="preserve"> </w:t>
-      </w:r>
-      <w:r>
-        <w:rPr>
-          <w:sz w:val="22"/>
-        </w:rPr>
-        <w:t>Sensing,</w:t>
-      </w:r>
-      <w:r>
-        <w:rPr>
-          <w:sz w:val="22"/>
-        </w:rPr>
-        <w:t xml:space="preserve"> </w:t>
-      </w:r>
-      <w:r>
-        <w:rPr>
-          <w:sz w:val="22"/>
-        </w:rPr>
-        <w:t>Motion</w:t>
-      </w:r>
-      <w:r>
-        <w:rPr>
-          <w:sz w:val="22"/>
-        </w:rPr>
-        <w:t xml:space="preserve"> </w:t>
-      </w:r>
-      <w:r>
-        <w:rPr>
-          <w:sz w:val="22"/>
-        </w:rPr>
-        <w:t>Planning</w:t>
-      </w:r>
-      <w:r>
-        <w:rPr>
-          <w:sz w:val="22"/>
-        </w:rPr>
-        <w:t xml:space="preserve"> </w:t>
-      </w:r>
-      <w:r>
-        <w:rPr>
-          <w:sz w:val="22"/>
-        </w:rPr>
-        <w:t>(trajectory</w:t>
-      </w:r>
-      <w:r>
-        <w:rPr>
-          <w:sz w:val="22"/>
-        </w:rPr>
-        <w:t xml:space="preserve"> </w:t>
-      </w:r>
-      <w:r>
-        <w:rPr>
-          <w:sz w:val="22"/>
-        </w:rPr>
-        <w:t>generation,</w:t>
-      </w:r>
-      <w:r>
-        <w:rPr>
-          <w:sz w:val="22"/>
-        </w:rPr>
-        <w:t xml:space="preserve"> </w:t>
-      </w:r>
-      <w:r>
-        <w:rPr>
-          <w:sz w:val="22"/>
-        </w:rPr>
-        <w:t>trajectory</w:t>
-      </w:r>
-      <w:r>
-        <w:rPr>
-          <w:sz w:val="22"/>
-        </w:rPr>
-        <w:t xml:space="preserve"> </w:t>
-      </w:r>
-      <w:r>
-        <w:rPr>
-          <w:sz w:val="22"/>
-        </w:rPr>
-        <w:t>optimization),</w:t>
-      </w:r>
-      <w:r>
-        <w:rPr>
-          <w:sz w:val="22"/>
-        </w:rPr>
-        <w:t xml:space="preserve"> </w:t>
-      </w:r>
-      <w:r>
-        <w:rPr>
-          <w:sz w:val="22"/>
-        </w:rPr>
-        <w:t>Sim-to-Real</w:t>
-      </w:r>
-      <w:r>
-        <w:rPr>
-          <w:sz w:val="22"/>
-        </w:rPr>
-        <w:t xml:space="preserve"> </w:t>
-      </w:r>
-      <w:r>
-        <w:rPr>
-          <w:sz w:val="22"/>
-        </w:rPr>
-        <w:t>Transfer</w:t>
+          <w:szCs w:val="22"/>
+          <w:rtl w:val="0"/>
+        </w:rPr>
+        <w:t>Robotics: Kinematics (forward, inverse), Bimanual Manipulation, Grasping, Computer Vision (SLAM, VIO, OpenCV), Tactile Sensing, Motion Planning (trajectory generation, trajectory optimization), Sim-to-Real Transfer</w:t>
       </w:r>
     </w:p>
     <w:p>

</xml_diff>

<commit_message>
feat(applications): add Skild AI Robotics Engineer Manipulation tailored resume
ATS-optimized resume (72→84/100): added visuomotor policy learning,
perception stacks, Rigid Body Dynamics, 2D/3D Perception, and
cross-functional research collaboration keywords. Yellow highlights
mark 5 changed paragraphs vs standard RL_Controls base.

Co-Authored-By: Claude Sonnet 4.6 <noreply@anthropic.com>
</commit_message>
<xml_diff>
--- a/Applications/20260412_Skild_AI_Application_Robotics_Engineer_Manipulation/Alexander-Nettekoven-Resume-Skild-AI-Robotics-Engineer-Manipulation.docx
+++ b/Applications/20260412_Skild_AI_Application_Robotics_Engineer_Manipulation/Alexander-Nettekoven-Resume-Skild-AI-Robotics-Engineer-Manipulation.docx
@@ -174,15 +174,636 @@
       <w:r>
         <w:rPr>
           <w:sz w:val="22"/>
-          <w:szCs w:val="22"/>
-          <w:rtl w:val="0"/>
-        </w:rPr>
-        <w:t>Robotics researcher and engineer applying for [job title] at [company]. I specialize in reinforcement learning, sim-to-real transfer, and whole-body control for humanoid / semi-humanoid locomotion and manipulation. 5+ years building novel robotic systems and robot learning algorithms for real-world environments.</w:t>
-      </w:r>
-      <w:r>
-        <w:rPr>
-          <w:rtl w:val="0"/>
-        </w:rPr>
+        </w:rPr>
+        <w:t>Robotics</w:t>
+      </w:r>
+      <w:r>
+        <w:rPr>
+          <w:sz w:val="22"/>
+        </w:rPr>
+        <w:t xml:space="preserve"> </w:t>
+      </w:r>
+      <w:r>
+        <w:rPr>
+          <w:sz w:val="22"/>
+        </w:rPr>
+        <w:t>researcher</w:t>
+      </w:r>
+      <w:r>
+        <w:rPr>
+          <w:sz w:val="22"/>
+        </w:rPr>
+        <w:t xml:space="preserve"> </w:t>
+      </w:r>
+      <w:r>
+        <w:rPr>
+          <w:sz w:val="22"/>
+        </w:rPr>
+        <w:t>and</w:t>
+      </w:r>
+      <w:r>
+        <w:rPr>
+          <w:sz w:val="22"/>
+        </w:rPr>
+        <w:t xml:space="preserve"> </w:t>
+      </w:r>
+      <w:r>
+        <w:rPr>
+          <w:sz w:val="22"/>
+        </w:rPr>
+        <w:t>engineer</w:t>
+      </w:r>
+      <w:r>
+        <w:rPr>
+          <w:sz w:val="22"/>
+        </w:rPr>
+        <w:t xml:space="preserve"> </w:t>
+      </w:r>
+      <w:r>
+        <w:rPr>
+          <w:sz w:val="22"/>
+        </w:rPr>
+        <w:t>applying</w:t>
+      </w:r>
+      <w:r>
+        <w:rPr>
+          <w:sz w:val="22"/>
+        </w:rPr>
+        <w:t xml:space="preserve"> </w:t>
+      </w:r>
+      <w:r>
+        <w:rPr>
+          <w:sz w:val="22"/>
+        </w:rPr>
+        <w:t>for</w:t>
+      </w:r>
+      <w:r>
+        <w:rPr>
+          <w:sz w:val="22"/>
+        </w:rPr>
+        <w:t xml:space="preserve"> </w:t>
+      </w:r>
+      <w:r>
+        <w:rPr>
+          <w:sz w:val="22"/>
+          <w:highlight w:val="yellow"/>
+        </w:rPr>
+        <w:t>Robotics</w:t>
+      </w:r>
+      <w:r>
+        <w:rPr>
+          <w:sz w:val="22"/>
+        </w:rPr>
+        <w:t xml:space="preserve"> </w:t>
+      </w:r>
+      <w:r>
+        <w:rPr>
+          <w:sz w:val="22"/>
+          <w:highlight w:val="yellow"/>
+        </w:rPr>
+        <w:t>Engineer,</w:t>
+      </w:r>
+      <w:r>
+        <w:rPr>
+          <w:sz w:val="22"/>
+        </w:rPr>
+        <w:t xml:space="preserve"> </w:t>
+      </w:r>
+      <w:r>
+        <w:rPr>
+          <w:sz w:val="22"/>
+          <w:highlight w:val="yellow"/>
+        </w:rPr>
+        <w:t>Manipulation</w:t>
+      </w:r>
+      <w:r>
+        <w:rPr>
+          <w:sz w:val="22"/>
+        </w:rPr>
+        <w:t xml:space="preserve"> </w:t>
+      </w:r>
+      <w:r>
+        <w:rPr>
+          <w:sz w:val="22"/>
+        </w:rPr>
+        <w:t>at</w:t>
+      </w:r>
+      <w:r>
+        <w:rPr>
+          <w:sz w:val="22"/>
+        </w:rPr>
+        <w:t xml:space="preserve"> </w:t>
+      </w:r>
+      <w:r>
+        <w:rPr>
+          <w:sz w:val="22"/>
+          <w:highlight w:val="yellow"/>
+        </w:rPr>
+        <w:t>Skild</w:t>
+      </w:r>
+      <w:r>
+        <w:rPr>
+          <w:sz w:val="22"/>
+        </w:rPr>
+        <w:t xml:space="preserve"> </w:t>
+      </w:r>
+      <w:r>
+        <w:rPr>
+          <w:sz w:val="22"/>
+          <w:highlight w:val="yellow"/>
+        </w:rPr>
+        <w:t>AI.</w:t>
+      </w:r>
+      <w:r>
+        <w:rPr>
+          <w:sz w:val="22"/>
+        </w:rPr>
+        <w:t xml:space="preserve"> </w:t>
+      </w:r>
+      <w:r>
+        <w:rPr>
+          <w:sz w:val="22"/>
+        </w:rPr>
+        <w:t>I</w:t>
+      </w:r>
+      <w:r>
+        <w:rPr>
+          <w:sz w:val="22"/>
+        </w:rPr>
+        <w:t xml:space="preserve"> </w:t>
+      </w:r>
+      <w:r>
+        <w:rPr>
+          <w:sz w:val="22"/>
+        </w:rPr>
+        <w:t>specialize</w:t>
+      </w:r>
+      <w:r>
+        <w:rPr>
+          <w:sz w:val="22"/>
+        </w:rPr>
+        <w:t xml:space="preserve"> </w:t>
+      </w:r>
+      <w:r>
+        <w:rPr>
+          <w:sz w:val="22"/>
+        </w:rPr>
+        <w:t>in</w:t>
+      </w:r>
+      <w:r>
+        <w:rPr>
+          <w:sz w:val="22"/>
+        </w:rPr>
+        <w:t xml:space="preserve"> </w:t>
+      </w:r>
+      <w:r>
+        <w:rPr>
+          <w:sz w:val="22"/>
+        </w:rPr>
+        <w:t>reinforcement</w:t>
+      </w:r>
+      <w:r>
+        <w:rPr>
+          <w:sz w:val="22"/>
+        </w:rPr>
+        <w:t xml:space="preserve"> </w:t>
+      </w:r>
+      <w:r>
+        <w:rPr>
+          <w:sz w:val="22"/>
+        </w:rPr>
+        <w:t>learning,</w:t>
+      </w:r>
+      <w:r>
+        <w:rPr>
+          <w:sz w:val="22"/>
+        </w:rPr>
+        <w:t xml:space="preserve"> </w:t>
+      </w:r>
+      <w:r>
+        <w:rPr>
+          <w:sz w:val="22"/>
+        </w:rPr>
+        <w:t>sim-to-real</w:t>
+      </w:r>
+      <w:r>
+        <w:rPr>
+          <w:sz w:val="22"/>
+        </w:rPr>
+        <w:t xml:space="preserve"> </w:t>
+      </w:r>
+      <w:r>
+        <w:rPr>
+          <w:sz w:val="22"/>
+        </w:rPr>
+        <w:t>transfer,</w:t>
+      </w:r>
+      <w:r>
+        <w:rPr>
+          <w:sz w:val="22"/>
+        </w:rPr>
+        <w:t xml:space="preserve"> </w:t>
+      </w:r>
+      <w:r>
+        <w:rPr>
+          <w:sz w:val="22"/>
+        </w:rPr>
+        <w:t>and</w:t>
+      </w:r>
+      <w:r>
+        <w:rPr>
+          <w:sz w:val="22"/>
+        </w:rPr>
+        <w:t xml:space="preserve"> </w:t>
+      </w:r>
+      <w:r>
+        <w:rPr>
+          <w:sz w:val="22"/>
+          <w:highlight w:val="yellow"/>
+        </w:rPr>
+        <w:t>visuomotor</w:t>
+      </w:r>
+      <w:r>
+        <w:rPr>
+          <w:sz w:val="22"/>
+        </w:rPr>
+        <w:t xml:space="preserve"> </w:t>
+      </w:r>
+      <w:r>
+        <w:rPr>
+          <w:sz w:val="22"/>
+          <w:highlight w:val="yellow"/>
+        </w:rPr>
+        <w:t>policy</w:t>
+      </w:r>
+      <w:r>
+        <w:rPr>
+          <w:sz w:val="22"/>
+        </w:rPr>
+        <w:t xml:space="preserve"> </w:t>
+      </w:r>
+      <w:r>
+        <w:rPr>
+          <w:sz w:val="22"/>
+          <w:highlight w:val="yellow"/>
+        </w:rPr>
+        <w:t>learning</w:t>
+      </w:r>
+      <w:r>
+        <w:rPr>
+          <w:sz w:val="22"/>
+        </w:rPr>
+        <w:t xml:space="preserve"> </w:t>
+      </w:r>
+      <w:r>
+        <w:rPr>
+          <w:sz w:val="22"/>
+        </w:rPr>
+        <w:t>for</w:t>
+      </w:r>
+      <w:r>
+        <w:rPr>
+          <w:sz w:val="22"/>
+        </w:rPr>
+        <w:t xml:space="preserve"> </w:t>
+      </w:r>
+      <w:r>
+        <w:rPr>
+          <w:sz w:val="22"/>
+          <w:highlight w:val="yellow"/>
+        </w:rPr>
+        <w:t>real-world</w:t>
+      </w:r>
+      <w:r>
+        <w:rPr>
+          <w:sz w:val="22"/>
+        </w:rPr>
+        <w:t xml:space="preserve"> </w:t>
+      </w:r>
+      <w:r>
+        <w:rPr>
+          <w:sz w:val="22"/>
+        </w:rPr>
+        <w:t>manipulation.</w:t>
+      </w:r>
+      <w:r>
+        <w:rPr>
+          <w:sz w:val="22"/>
+        </w:rPr>
+        <w:t xml:space="preserve"> </w:t>
+      </w:r>
+      <w:r>
+        <w:rPr>
+          <w:sz w:val="22"/>
+        </w:rPr>
+        <w:t>5+</w:t>
+      </w:r>
+      <w:r>
+        <w:rPr>
+          <w:sz w:val="22"/>
+        </w:rPr>
+        <w:t xml:space="preserve"> </w:t>
+      </w:r>
+      <w:r>
+        <w:rPr>
+          <w:sz w:val="22"/>
+        </w:rPr>
+        <w:t>years</w:t>
+      </w:r>
+      <w:r>
+        <w:rPr>
+          <w:sz w:val="22"/>
+        </w:rPr>
+        <w:t xml:space="preserve"> </w:t>
+      </w:r>
+      <w:r>
+        <w:rPr>
+          <w:sz w:val="22"/>
+        </w:rPr>
+        <w:t>building</w:t>
+      </w:r>
+      <w:r>
+        <w:rPr>
+          <w:sz w:val="22"/>
+        </w:rPr>
+        <w:t xml:space="preserve"> </w:t>
+      </w:r>
+      <w:r>
+        <w:rPr>
+          <w:sz w:val="22"/>
+          <w:highlight w:val="yellow"/>
+        </w:rPr>
+        <w:t>and</w:t>
+      </w:r>
+      <w:r>
+        <w:rPr>
+          <w:sz w:val="22"/>
+        </w:rPr>
+        <w:t xml:space="preserve"> </w:t>
+      </w:r>
+      <w:r>
+        <w:rPr>
+          <w:sz w:val="22"/>
+          <w:highlight w:val="yellow"/>
+        </w:rPr>
+        <w:t>scaling</w:t>
+      </w:r>
+      <w:r>
+        <w:rPr>
+          <w:sz w:val="22"/>
+        </w:rPr>
+        <w:t xml:space="preserve"> </w:t>
+      </w:r>
+      <w:r>
+        <w:rPr>
+          <w:sz w:val="22"/>
+        </w:rPr>
+        <w:t>novel</w:t>
+      </w:r>
+      <w:r>
+        <w:rPr>
+          <w:sz w:val="22"/>
+        </w:rPr>
+        <w:t xml:space="preserve"> </w:t>
+      </w:r>
+      <w:r>
+        <w:rPr>
+          <w:sz w:val="22"/>
+        </w:rPr>
+        <w:t>robotic</w:t>
+      </w:r>
+      <w:r>
+        <w:rPr>
+          <w:sz w:val="22"/>
+        </w:rPr>
+        <w:t xml:space="preserve"> </w:t>
+      </w:r>
+      <w:r>
+        <w:rPr>
+          <w:sz w:val="22"/>
+          <w:highlight w:val="yellow"/>
+        </w:rPr>
+        <w:t>systems,</w:t>
+      </w:r>
+      <w:r>
+        <w:rPr>
+          <w:sz w:val="22"/>
+        </w:rPr>
+        <w:t xml:space="preserve"> </w:t>
+      </w:r>
+      <w:r>
+        <w:rPr>
+          <w:sz w:val="22"/>
+          <w:highlight w:val="yellow"/>
+        </w:rPr>
+        <w:t>from</w:t>
+      </w:r>
+      <w:r>
+        <w:rPr>
+          <w:sz w:val="22"/>
+        </w:rPr>
+        <w:t xml:space="preserve"> </w:t>
+      </w:r>
+      <w:r>
+        <w:rPr>
+          <w:sz w:val="22"/>
+          <w:highlight w:val="yellow"/>
+        </w:rPr>
+        <w:t>hardware</w:t>
+      </w:r>
+      <w:r>
+        <w:rPr>
+          <w:sz w:val="22"/>
+        </w:rPr>
+        <w:t xml:space="preserve"> </w:t>
+      </w:r>
+      <w:r>
+        <w:rPr>
+          <w:sz w:val="22"/>
+          <w:highlight w:val="yellow"/>
+        </w:rPr>
+        <w:t>testbeds</w:t>
+      </w:r>
+      <w:r>
+        <w:rPr>
+          <w:sz w:val="22"/>
+        </w:rPr>
+        <w:t xml:space="preserve"> </w:t>
+      </w:r>
+      <w:r>
+        <w:rPr>
+          <w:sz w:val="22"/>
+        </w:rPr>
+        <w:t>and</w:t>
+      </w:r>
+      <w:r>
+        <w:rPr>
+          <w:sz w:val="22"/>
+        </w:rPr>
+        <w:t xml:space="preserve"> </w:t>
+      </w:r>
+      <w:r>
+        <w:rPr>
+          <w:sz w:val="22"/>
+          <w:highlight w:val="yellow"/>
+        </w:rPr>
+        <w:t>perception</w:t>
+      </w:r>
+      <w:r>
+        <w:rPr>
+          <w:sz w:val="22"/>
+        </w:rPr>
+        <w:t xml:space="preserve"> </w:t>
+      </w:r>
+      <w:r>
+        <w:rPr>
+          <w:sz w:val="22"/>
+          <w:highlight w:val="yellow"/>
+        </w:rPr>
+        <w:t>stacks</w:t>
+      </w:r>
+      <w:r>
+        <w:rPr>
+          <w:sz w:val="22"/>
+        </w:rPr>
+        <w:t xml:space="preserve"> </w:t>
+      </w:r>
+      <w:r>
+        <w:rPr>
+          <w:sz w:val="22"/>
+          <w:highlight w:val="yellow"/>
+        </w:rPr>
+        <w:t>to</w:t>
+      </w:r>
+      <w:r>
+        <w:rPr>
+          <w:sz w:val="22"/>
+        </w:rPr>
+        <w:t xml:space="preserve"> </w:t>
+      </w:r>
+      <w:r>
+        <w:rPr>
+          <w:sz w:val="22"/>
+          <w:highlight w:val="yellow"/>
+        </w:rPr>
+        <w:t>full</w:t>
+      </w:r>
+      <w:r>
+        <w:rPr>
+          <w:sz w:val="22"/>
+        </w:rPr>
+        <w:t xml:space="preserve"> </w:t>
+      </w:r>
+      <w:r>
+        <w:rPr>
+          <w:sz w:val="22"/>
+          <w:highlight w:val="yellow"/>
+        </w:rPr>
+        <w:t>autonomy</w:t>
+      </w:r>
+      <w:r>
+        <w:rPr>
+          <w:sz w:val="22"/>
+        </w:rPr>
+        <w:t xml:space="preserve"> </w:t>
+      </w:r>
+      <w:r>
+        <w:rPr>
+          <w:sz w:val="22"/>
+          <w:highlight w:val="yellow"/>
+        </w:rPr>
+        <w:t>stacks,</w:t>
+      </w:r>
+      <w:r>
+        <w:rPr>
+          <w:sz w:val="22"/>
+        </w:rPr>
+        <w:t xml:space="preserve"> </w:t>
+      </w:r>
+      <w:r>
+        <w:rPr>
+          <w:sz w:val="22"/>
+          <w:highlight w:val="yellow"/>
+        </w:rPr>
+        <w:t>with</w:t>
+      </w:r>
+      <w:r>
+        <w:rPr>
+          <w:sz w:val="22"/>
+        </w:rPr>
+        <w:t xml:space="preserve"> </w:t>
+      </w:r>
+      <w:r>
+        <w:rPr>
+          <w:sz w:val="22"/>
+          <w:highlight w:val="yellow"/>
+        </w:rPr>
+        <w:t>end-to-end</w:t>
+      </w:r>
+      <w:r>
+        <w:rPr>
+          <w:sz w:val="22"/>
+        </w:rPr>
+        <w:t xml:space="preserve"> </w:t>
+      </w:r>
+      <w:r>
+        <w:rPr>
+          <w:sz w:val="22"/>
+          <w:highlight w:val="yellow"/>
+        </w:rPr>
+        <w:t>ownership</w:t>
+      </w:r>
+      <w:r>
+        <w:rPr>
+          <w:sz w:val="22"/>
+        </w:rPr>
+        <w:t xml:space="preserve"> </w:t>
+      </w:r>
+      <w:r>
+        <w:rPr>
+          <w:sz w:val="22"/>
+          <w:highlight w:val="yellow"/>
+        </w:rPr>
+        <w:t>from</w:t>
+      </w:r>
+      <w:r>
+        <w:rPr>
+          <w:sz w:val="22"/>
+        </w:rPr>
+        <w:t xml:space="preserve"> </w:t>
+      </w:r>
+      <w:r>
+        <w:rPr>
+          <w:sz w:val="22"/>
+          <w:highlight w:val="yellow"/>
+        </w:rPr>
+        <w:t>training</w:t>
+      </w:r>
+      <w:r>
+        <w:rPr>
+          <w:sz w:val="22"/>
+        </w:rPr>
+        <w:t xml:space="preserve"> </w:t>
+      </w:r>
+      <w:r>
+        <w:rPr>
+          <w:sz w:val="22"/>
+          <w:highlight w:val="yellow"/>
+        </w:rPr>
+        <w:t>to</w:t>
+      </w:r>
+      <w:r>
+        <w:rPr>
+          <w:sz w:val="22"/>
+        </w:rPr>
+        <w:t xml:space="preserve"> </w:t>
+      </w:r>
+      <w:r>
+        <w:rPr>
+          <w:sz w:val="22"/>
+          <w:highlight w:val="yellow"/>
+        </w:rPr>
+        <w:t>deployment.</w:t>
       </w:r>
     </w:p>
     <w:p>
@@ -918,10 +1539,297 @@
       <w:r>
         <w:rPr>
           <w:sz w:val="22"/>
-          <w:szCs w:val="22"/>
-          <w:rtl w:val="0"/>
-        </w:rPr>
-        <w:t>Developed novel robotic systems and algorithms via deep learning, sim-to-real transfer, and end-to-end system design in collaboration with Caltech, UC Berkeley, Northeastern, and RPI:</w:t>
+        </w:rPr>
+        <w:t>Developed</w:t>
+      </w:r>
+      <w:r>
+        <w:rPr>
+          <w:sz w:val="22"/>
+        </w:rPr>
+        <w:t xml:space="preserve"> </w:t>
+      </w:r>
+      <w:r>
+        <w:rPr>
+          <w:sz w:val="22"/>
+        </w:rPr>
+        <w:t>novel</w:t>
+      </w:r>
+      <w:r>
+        <w:rPr>
+          <w:sz w:val="22"/>
+        </w:rPr>
+        <w:t xml:space="preserve"> </w:t>
+      </w:r>
+      <w:r>
+        <w:rPr>
+          <w:sz w:val="22"/>
+        </w:rPr>
+        <w:t>robotic</w:t>
+      </w:r>
+      <w:r>
+        <w:rPr>
+          <w:sz w:val="22"/>
+        </w:rPr>
+        <w:t xml:space="preserve"> </w:t>
+      </w:r>
+      <w:r>
+        <w:rPr>
+          <w:sz w:val="22"/>
+        </w:rPr>
+        <w:t>systems</w:t>
+      </w:r>
+      <w:r>
+        <w:rPr>
+          <w:sz w:val="22"/>
+        </w:rPr>
+        <w:t xml:space="preserve"> </w:t>
+      </w:r>
+      <w:r>
+        <w:rPr>
+          <w:sz w:val="22"/>
+        </w:rPr>
+        <w:t>and</w:t>
+      </w:r>
+      <w:r>
+        <w:rPr>
+          <w:sz w:val="22"/>
+        </w:rPr>
+        <w:t xml:space="preserve"> </w:t>
+      </w:r>
+      <w:r>
+        <w:rPr>
+          <w:sz w:val="22"/>
+        </w:rPr>
+        <w:t>algorithms</w:t>
+      </w:r>
+      <w:r>
+        <w:rPr>
+          <w:sz w:val="22"/>
+        </w:rPr>
+        <w:t xml:space="preserve"> </w:t>
+      </w:r>
+      <w:r>
+        <w:rPr>
+          <w:sz w:val="22"/>
+        </w:rPr>
+        <w:t>via</w:t>
+      </w:r>
+      <w:r>
+        <w:rPr>
+          <w:sz w:val="22"/>
+        </w:rPr>
+        <w:t xml:space="preserve"> </w:t>
+      </w:r>
+      <w:r>
+        <w:rPr>
+          <w:sz w:val="22"/>
+        </w:rPr>
+        <w:t>deep</w:t>
+      </w:r>
+      <w:r>
+        <w:rPr>
+          <w:sz w:val="22"/>
+        </w:rPr>
+        <w:t xml:space="preserve"> </w:t>
+      </w:r>
+      <w:r>
+        <w:rPr>
+          <w:sz w:val="22"/>
+        </w:rPr>
+        <w:t>learning,</w:t>
+      </w:r>
+      <w:r>
+        <w:rPr>
+          <w:sz w:val="22"/>
+        </w:rPr>
+        <w:t xml:space="preserve"> </w:t>
+      </w:r>
+      <w:r>
+        <w:rPr>
+          <w:sz w:val="22"/>
+          <w:highlight w:val="yellow"/>
+        </w:rPr>
+        <w:t>controls,</w:t>
+      </w:r>
+      <w:r>
+        <w:rPr>
+          <w:sz w:val="22"/>
+        </w:rPr>
+        <w:t xml:space="preserve"> </w:t>
+      </w:r>
+      <w:r>
+        <w:rPr>
+          <w:sz w:val="22"/>
+        </w:rPr>
+        <w:t>sim-to-real</w:t>
+      </w:r>
+      <w:r>
+        <w:rPr>
+          <w:sz w:val="22"/>
+        </w:rPr>
+        <w:t xml:space="preserve"> </w:t>
+      </w:r>
+      <w:r>
+        <w:rPr>
+          <w:sz w:val="22"/>
+        </w:rPr>
+        <w:t>transfer,</w:t>
+      </w:r>
+      <w:r>
+        <w:rPr>
+          <w:sz w:val="22"/>
+        </w:rPr>
+        <w:t xml:space="preserve"> </w:t>
+      </w:r>
+      <w:r>
+        <w:rPr>
+          <w:sz w:val="22"/>
+        </w:rPr>
+        <w:t>and</w:t>
+      </w:r>
+      <w:r>
+        <w:rPr>
+          <w:sz w:val="22"/>
+        </w:rPr>
+        <w:t xml:space="preserve"> </w:t>
+      </w:r>
+      <w:r>
+        <w:rPr>
+          <w:sz w:val="22"/>
+        </w:rPr>
+        <w:t>end-to-end</w:t>
+      </w:r>
+      <w:r>
+        <w:rPr>
+          <w:sz w:val="22"/>
+        </w:rPr>
+        <w:t xml:space="preserve"> </w:t>
+      </w:r>
+      <w:r>
+        <w:rPr>
+          <w:sz w:val="22"/>
+        </w:rPr>
+        <w:t>system</w:t>
+      </w:r>
+      <w:r>
+        <w:rPr>
+          <w:sz w:val="22"/>
+        </w:rPr>
+        <w:t xml:space="preserve"> </w:t>
+      </w:r>
+      <w:r>
+        <w:rPr>
+          <w:sz w:val="22"/>
+        </w:rPr>
+        <w:t>design</w:t>
+      </w:r>
+      <w:r>
+        <w:rPr>
+          <w:sz w:val="22"/>
+        </w:rPr>
+        <w:t xml:space="preserve"> </w:t>
+      </w:r>
+      <w:r>
+        <w:rPr>
+          <w:sz w:val="22"/>
+        </w:rPr>
+        <w:t>in</w:t>
+      </w:r>
+      <w:r>
+        <w:rPr>
+          <w:sz w:val="22"/>
+        </w:rPr>
+        <w:t xml:space="preserve"> </w:t>
+      </w:r>
+      <w:r>
+        <w:rPr>
+          <w:sz w:val="22"/>
+        </w:rPr>
+        <w:t>collaboration</w:t>
+      </w:r>
+      <w:r>
+        <w:rPr>
+          <w:sz w:val="22"/>
+        </w:rPr>
+        <w:t xml:space="preserve"> </w:t>
+      </w:r>
+      <w:r>
+        <w:rPr>
+          <w:sz w:val="22"/>
+        </w:rPr>
+        <w:t>with</w:t>
+      </w:r>
+      <w:r>
+        <w:rPr>
+          <w:sz w:val="22"/>
+        </w:rPr>
+        <w:t xml:space="preserve"> </w:t>
+      </w:r>
+      <w:r>
+        <w:rPr>
+          <w:sz w:val="22"/>
+        </w:rPr>
+        <w:t>Caltech,</w:t>
+      </w:r>
+      <w:r>
+        <w:rPr>
+          <w:sz w:val="22"/>
+        </w:rPr>
+        <w:t xml:space="preserve"> </w:t>
+      </w:r>
+      <w:r>
+        <w:rPr>
+          <w:sz w:val="22"/>
+        </w:rPr>
+        <w:t>UC</w:t>
+      </w:r>
+      <w:r>
+        <w:rPr>
+          <w:sz w:val="22"/>
+        </w:rPr>
+        <w:t xml:space="preserve"> </w:t>
+      </w:r>
+      <w:r>
+        <w:rPr>
+          <w:sz w:val="22"/>
+        </w:rPr>
+        <w:t>Berkeley,</w:t>
+      </w:r>
+      <w:r>
+        <w:rPr>
+          <w:sz w:val="22"/>
+        </w:rPr>
+        <w:t xml:space="preserve"> </w:t>
+      </w:r>
+      <w:r>
+        <w:rPr>
+          <w:sz w:val="22"/>
+        </w:rPr>
+        <w:t>Northeastern,</w:t>
+      </w:r>
+      <w:r>
+        <w:rPr>
+          <w:sz w:val="22"/>
+        </w:rPr>
+        <w:t xml:space="preserve"> </w:t>
+      </w:r>
+      <w:r>
+        <w:rPr>
+          <w:sz w:val="22"/>
+        </w:rPr>
+        <w:t>and</w:t>
+      </w:r>
+      <w:r>
+        <w:rPr>
+          <w:sz w:val="22"/>
+        </w:rPr>
+        <w:t xml:space="preserve"> </w:t>
+      </w:r>
+      <w:r>
+        <w:rPr>
+          <w:sz w:val="22"/>
+        </w:rPr>
+        <w:t>RPI:</w:t>
       </w:r>
     </w:p>
     <w:p>
@@ -1448,10 +2356,287 @@
       <w:r>
         <w:rPr>
           <w:sz w:val="22"/>
-          <w:szCs w:val="22"/>
-          <w:rtl w:val="0"/>
-        </w:rPr>
-        <w:t>Control: Real-Time Feedback Control (Optimal Control, Nonlinear Control, PID), Model Predictive Control (MPC), Whole-Body Control, State Estimation (Kalman Filters, EKF, EKF2)</w:t>
+        </w:rPr>
+        <w:t>Control:</w:t>
+      </w:r>
+      <w:r>
+        <w:rPr>
+          <w:sz w:val="22"/>
+        </w:rPr>
+        <w:t xml:space="preserve"> </w:t>
+      </w:r>
+      <w:r>
+        <w:rPr>
+          <w:sz w:val="22"/>
+        </w:rPr>
+        <w:t>Real-Time</w:t>
+      </w:r>
+      <w:r>
+        <w:rPr>
+          <w:sz w:val="22"/>
+        </w:rPr>
+        <w:t xml:space="preserve"> </w:t>
+      </w:r>
+      <w:r>
+        <w:rPr>
+          <w:sz w:val="22"/>
+        </w:rPr>
+        <w:t>Feedback</w:t>
+      </w:r>
+      <w:r>
+        <w:rPr>
+          <w:sz w:val="22"/>
+        </w:rPr>
+        <w:t xml:space="preserve"> </w:t>
+      </w:r>
+      <w:r>
+        <w:rPr>
+          <w:sz w:val="22"/>
+        </w:rPr>
+        <w:t>Control</w:t>
+      </w:r>
+      <w:r>
+        <w:rPr>
+          <w:sz w:val="22"/>
+        </w:rPr>
+        <w:t xml:space="preserve"> </w:t>
+      </w:r>
+      <w:r>
+        <w:rPr>
+          <w:sz w:val="22"/>
+        </w:rPr>
+        <w:t>(Optimal</w:t>
+      </w:r>
+      <w:r>
+        <w:rPr>
+          <w:sz w:val="22"/>
+        </w:rPr>
+        <w:t xml:space="preserve"> </w:t>
+      </w:r>
+      <w:r>
+        <w:rPr>
+          <w:sz w:val="22"/>
+        </w:rPr>
+        <w:t>Control,</w:t>
+      </w:r>
+      <w:r>
+        <w:rPr>
+          <w:sz w:val="22"/>
+        </w:rPr>
+        <w:t xml:space="preserve"> </w:t>
+      </w:r>
+      <w:r>
+        <w:rPr>
+          <w:sz w:val="22"/>
+        </w:rPr>
+        <w:t>Nonlinear</w:t>
+      </w:r>
+      <w:r>
+        <w:rPr>
+          <w:sz w:val="22"/>
+        </w:rPr>
+        <w:t xml:space="preserve"> </w:t>
+      </w:r>
+      <w:r>
+        <w:rPr>
+          <w:sz w:val="22"/>
+        </w:rPr>
+        <w:t>Control,</w:t>
+      </w:r>
+      <w:r>
+        <w:rPr>
+          <w:sz w:val="22"/>
+        </w:rPr>
+        <w:t xml:space="preserve"> </w:t>
+      </w:r>
+      <w:r>
+        <w:rPr>
+          <w:sz w:val="22"/>
+        </w:rPr>
+        <w:t>PID),</w:t>
+      </w:r>
+      <w:r>
+        <w:rPr>
+          <w:sz w:val="22"/>
+        </w:rPr>
+        <w:t xml:space="preserve"> </w:t>
+      </w:r>
+      <w:r>
+        <w:rPr>
+          <w:sz w:val="22"/>
+        </w:rPr>
+        <w:t>Model</w:t>
+      </w:r>
+      <w:r>
+        <w:rPr>
+          <w:sz w:val="22"/>
+        </w:rPr>
+        <w:t xml:space="preserve"> </w:t>
+      </w:r>
+      <w:r>
+        <w:rPr>
+          <w:sz w:val="22"/>
+        </w:rPr>
+        <w:t>Predictive</w:t>
+      </w:r>
+      <w:r>
+        <w:rPr>
+          <w:sz w:val="22"/>
+        </w:rPr>
+        <w:t xml:space="preserve"> </w:t>
+      </w:r>
+      <w:r>
+        <w:rPr>
+          <w:sz w:val="22"/>
+        </w:rPr>
+        <w:t>Control</w:t>
+      </w:r>
+      <w:r>
+        <w:rPr>
+          <w:sz w:val="22"/>
+        </w:rPr>
+        <w:t xml:space="preserve"> </w:t>
+      </w:r>
+      <w:r>
+        <w:rPr>
+          <w:sz w:val="22"/>
+        </w:rPr>
+        <w:t>(MPC),</w:t>
+      </w:r>
+      <w:r>
+        <w:rPr>
+          <w:sz w:val="22"/>
+        </w:rPr>
+        <w:t xml:space="preserve"> </w:t>
+      </w:r>
+      <w:r>
+        <w:rPr>
+          <w:sz w:val="22"/>
+        </w:rPr>
+        <w:t>Whole-Body</w:t>
+      </w:r>
+      <w:r>
+        <w:rPr>
+          <w:sz w:val="22"/>
+        </w:rPr>
+        <w:t xml:space="preserve"> </w:t>
+      </w:r>
+      <w:r>
+        <w:rPr>
+          <w:sz w:val="22"/>
+        </w:rPr>
+        <w:t>Control,</w:t>
+      </w:r>
+      <w:r>
+        <w:rPr>
+          <w:sz w:val="22"/>
+        </w:rPr>
+        <w:t xml:space="preserve"> </w:t>
+      </w:r>
+      <w:r>
+        <w:rPr>
+          <w:sz w:val="22"/>
+          <w:highlight w:val="yellow"/>
+        </w:rPr>
+        <w:t>Rigid</w:t>
+      </w:r>
+      <w:r>
+        <w:rPr>
+          <w:sz w:val="22"/>
+        </w:rPr>
+        <w:t xml:space="preserve"> </w:t>
+      </w:r>
+      <w:r>
+        <w:rPr>
+          <w:sz w:val="22"/>
+          <w:highlight w:val="yellow"/>
+        </w:rPr>
+        <w:t>Body</w:t>
+      </w:r>
+      <w:r>
+        <w:rPr>
+          <w:sz w:val="22"/>
+        </w:rPr>
+        <w:t xml:space="preserve"> </w:t>
+      </w:r>
+      <w:r>
+        <w:rPr>
+          <w:sz w:val="22"/>
+          <w:highlight w:val="yellow"/>
+        </w:rPr>
+        <w:t>Dynamics,</w:t>
+      </w:r>
+      <w:r>
+        <w:rPr>
+          <w:sz w:val="22"/>
+        </w:rPr>
+        <w:t xml:space="preserve"> </w:t>
+      </w:r>
+      <w:r>
+        <w:rPr>
+          <w:sz w:val="22"/>
+        </w:rPr>
+        <w:t>State</w:t>
+      </w:r>
+      <w:r>
+        <w:rPr>
+          <w:sz w:val="22"/>
+        </w:rPr>
+        <w:t xml:space="preserve"> </w:t>
+      </w:r>
+      <w:r>
+        <w:rPr>
+          <w:sz w:val="22"/>
+        </w:rPr>
+        <w:t>Estimation</w:t>
+      </w:r>
+      <w:r>
+        <w:rPr>
+          <w:sz w:val="22"/>
+        </w:rPr>
+        <w:t xml:space="preserve"> </w:t>
+      </w:r>
+      <w:r>
+        <w:rPr>
+          <w:sz w:val="22"/>
+        </w:rPr>
+        <w:t>(Kalman</w:t>
+      </w:r>
+      <w:r>
+        <w:rPr>
+          <w:sz w:val="22"/>
+        </w:rPr>
+        <w:t xml:space="preserve"> </w:t>
+      </w:r>
+      <w:r>
+        <w:rPr>
+          <w:sz w:val="22"/>
+        </w:rPr>
+        <w:t>Filters,</w:t>
+      </w:r>
+      <w:r>
+        <w:rPr>
+          <w:sz w:val="22"/>
+        </w:rPr>
+        <w:t xml:space="preserve"> </w:t>
+      </w:r>
+      <w:r>
+        <w:rPr>
+          <w:sz w:val="22"/>
+        </w:rPr>
+        <w:t>EKF,</w:t>
+      </w:r>
+      <w:r>
+        <w:rPr>
+          <w:sz w:val="22"/>
+        </w:rPr>
+        <w:t xml:space="preserve"> </w:t>
+      </w:r>
+      <w:r>
+        <w:rPr>
+          <w:sz w:val="22"/>
+        </w:rPr>
+        <w:t>EKF2)</w:t>
       </w:r>
     </w:p>
     <w:p>
@@ -1469,10 +2654,315 @@
       <w:r>
         <w:rPr>
           <w:sz w:val="22"/>
-          <w:szCs w:val="22"/>
-          <w:rtl w:val="0"/>
-        </w:rPr>
-        <w:t>Robotics: Kinematics (forward, inverse), Bimanual Manipulation, Grasping, Computer Vision (SLAM, VIO, OpenCV), Tactile Sensing, Motion Planning (trajectory generation, trajectory optimization), Sim-to-Real Transfer</w:t>
+        </w:rPr>
+        <w:t>Robotics:</w:t>
+      </w:r>
+      <w:r>
+        <w:rPr>
+          <w:sz w:val="22"/>
+        </w:rPr>
+        <w:t xml:space="preserve"> </w:t>
+      </w:r>
+      <w:r>
+        <w:rPr>
+          <w:sz w:val="22"/>
+        </w:rPr>
+        <w:t>Kinematics</w:t>
+      </w:r>
+      <w:r>
+        <w:rPr>
+          <w:sz w:val="22"/>
+        </w:rPr>
+        <w:t xml:space="preserve"> </w:t>
+      </w:r>
+      <w:r>
+        <w:rPr>
+          <w:sz w:val="22"/>
+        </w:rPr>
+        <w:t>(forward,</w:t>
+      </w:r>
+      <w:r>
+        <w:rPr>
+          <w:sz w:val="22"/>
+        </w:rPr>
+        <w:t xml:space="preserve"> </w:t>
+      </w:r>
+      <w:r>
+        <w:rPr>
+          <w:sz w:val="22"/>
+        </w:rPr>
+        <w:t>inverse),</w:t>
+      </w:r>
+      <w:r>
+        <w:rPr>
+          <w:sz w:val="22"/>
+        </w:rPr>
+        <w:t xml:space="preserve"> </w:t>
+      </w:r>
+      <w:r>
+        <w:rPr>
+          <w:sz w:val="22"/>
+        </w:rPr>
+        <w:t>Bimanual</w:t>
+      </w:r>
+      <w:r>
+        <w:rPr>
+          <w:sz w:val="22"/>
+        </w:rPr>
+        <w:t xml:space="preserve"> </w:t>
+      </w:r>
+      <w:r>
+        <w:rPr>
+          <w:sz w:val="22"/>
+        </w:rPr>
+        <w:t>Manipulation,</w:t>
+      </w:r>
+      <w:r>
+        <w:rPr>
+          <w:sz w:val="22"/>
+        </w:rPr>
+        <w:t xml:space="preserve"> </w:t>
+      </w:r>
+      <w:r>
+        <w:rPr>
+          <w:sz w:val="22"/>
+        </w:rPr>
+        <w:t>Grasping,</w:t>
+      </w:r>
+      <w:r>
+        <w:rPr>
+          <w:sz w:val="22"/>
+        </w:rPr>
+        <w:t xml:space="preserve"> </w:t>
+      </w:r>
+      <w:r>
+        <w:rPr>
+          <w:sz w:val="22"/>
+          <w:highlight w:val="yellow"/>
+        </w:rPr>
+        <w:t>2D/3D</w:t>
+      </w:r>
+      <w:r>
+        <w:rPr>
+          <w:sz w:val="22"/>
+        </w:rPr>
+        <w:t xml:space="preserve"> </w:t>
+      </w:r>
+      <w:r>
+        <w:rPr>
+          <w:sz w:val="22"/>
+          <w:highlight w:val="yellow"/>
+        </w:rPr>
+        <w:t>Perception</w:t>
+      </w:r>
+      <w:r>
+        <w:rPr>
+          <w:sz w:val="22"/>
+        </w:rPr>
+        <w:t xml:space="preserve"> </w:t>
+      </w:r>
+      <w:r>
+        <w:rPr>
+          <w:sz w:val="22"/>
+        </w:rPr>
+        <w:t>(SLAM,</w:t>
+      </w:r>
+      <w:r>
+        <w:rPr>
+          <w:sz w:val="22"/>
+        </w:rPr>
+        <w:t xml:space="preserve"> </w:t>
+      </w:r>
+      <w:r>
+        <w:rPr>
+          <w:sz w:val="22"/>
+        </w:rPr>
+        <w:t>VIO,</w:t>
+      </w:r>
+      <w:r>
+        <w:rPr>
+          <w:sz w:val="22"/>
+        </w:rPr>
+        <w:t xml:space="preserve"> </w:t>
+      </w:r>
+      <w:r>
+        <w:rPr>
+          <w:sz w:val="22"/>
+          <w:highlight w:val="yellow"/>
+        </w:rPr>
+        <w:t>OpenCV,</w:t>
+      </w:r>
+      <w:r>
+        <w:rPr>
+          <w:sz w:val="22"/>
+        </w:rPr>
+        <w:t xml:space="preserve"> </w:t>
+      </w:r>
+      <w:r>
+        <w:rPr>
+          <w:sz w:val="22"/>
+          <w:highlight w:val="yellow"/>
+        </w:rPr>
+        <w:t>scene</w:t>
+      </w:r>
+      <w:r>
+        <w:rPr>
+          <w:sz w:val="22"/>
+        </w:rPr>
+        <w:t xml:space="preserve"> </w:t>
+      </w:r>
+      <w:r>
+        <w:rPr>
+          <w:sz w:val="22"/>
+          <w:highlight w:val="yellow"/>
+        </w:rPr>
+        <w:t>understanding,</w:t>
+      </w:r>
+      <w:r>
+        <w:rPr>
+          <w:sz w:val="22"/>
+        </w:rPr>
+        <w:t xml:space="preserve"> </w:t>
+      </w:r>
+      <w:r>
+        <w:rPr>
+          <w:sz w:val="22"/>
+          <w:highlight w:val="yellow"/>
+        </w:rPr>
+        <w:t>spatial</w:t>
+      </w:r>
+      <w:r>
+        <w:rPr>
+          <w:sz w:val="22"/>
+        </w:rPr>
+        <w:t xml:space="preserve"> </w:t>
+      </w:r>
+      <w:r>
+        <w:rPr>
+          <w:sz w:val="22"/>
+          <w:highlight w:val="yellow"/>
+        </w:rPr>
+        <w:t>reasoning),</w:t>
+      </w:r>
+      <w:r>
+        <w:rPr>
+          <w:sz w:val="22"/>
+        </w:rPr>
+        <w:t xml:space="preserve"> </w:t>
+      </w:r>
+      <w:r>
+        <w:rPr>
+          <w:sz w:val="22"/>
+        </w:rPr>
+        <w:t>Tactile</w:t>
+      </w:r>
+      <w:r>
+        <w:rPr>
+          <w:sz w:val="22"/>
+        </w:rPr>
+        <w:t xml:space="preserve"> </w:t>
+      </w:r>
+      <w:r>
+        <w:rPr>
+          <w:sz w:val="22"/>
+        </w:rPr>
+        <w:t>Sensing,</w:t>
+      </w:r>
+      <w:r>
+        <w:rPr>
+          <w:sz w:val="22"/>
+        </w:rPr>
+        <w:t xml:space="preserve"> </w:t>
+      </w:r>
+      <w:r>
+        <w:rPr>
+          <w:sz w:val="22"/>
+        </w:rPr>
+        <w:t>Motion</w:t>
+      </w:r>
+      <w:r>
+        <w:rPr>
+          <w:sz w:val="22"/>
+        </w:rPr>
+        <w:t xml:space="preserve"> </w:t>
+      </w:r>
+      <w:r>
+        <w:rPr>
+          <w:sz w:val="22"/>
+        </w:rPr>
+        <w:t>Planning</w:t>
+      </w:r>
+      <w:r>
+        <w:rPr>
+          <w:sz w:val="22"/>
+        </w:rPr>
+        <w:t xml:space="preserve"> </w:t>
+      </w:r>
+      <w:r>
+        <w:rPr>
+          <w:sz w:val="22"/>
+        </w:rPr>
+        <w:t>(trajectory</w:t>
+      </w:r>
+      <w:r>
+        <w:rPr>
+          <w:sz w:val="22"/>
+        </w:rPr>
+        <w:t xml:space="preserve"> </w:t>
+      </w:r>
+      <w:r>
+        <w:rPr>
+          <w:sz w:val="22"/>
+        </w:rPr>
+        <w:t>generation,</w:t>
+      </w:r>
+      <w:r>
+        <w:rPr>
+          <w:sz w:val="22"/>
+        </w:rPr>
+        <w:t xml:space="preserve"> </w:t>
+      </w:r>
+      <w:r>
+        <w:rPr>
+          <w:sz w:val="22"/>
+        </w:rPr>
+        <w:t>trajectory</w:t>
+      </w:r>
+      <w:r>
+        <w:rPr>
+          <w:sz w:val="22"/>
+        </w:rPr>
+        <w:t xml:space="preserve"> </w:t>
+      </w:r>
+      <w:r>
+        <w:rPr>
+          <w:sz w:val="22"/>
+        </w:rPr>
+        <w:t>optimization),</w:t>
+      </w:r>
+      <w:r>
+        <w:rPr>
+          <w:sz w:val="22"/>
+        </w:rPr>
+        <w:t xml:space="preserve"> </w:t>
+      </w:r>
+      <w:r>
+        <w:rPr>
+          <w:sz w:val="22"/>
+        </w:rPr>
+        <w:t>Sim-to-Real</w:t>
+      </w:r>
+      <w:r>
+        <w:rPr>
+          <w:sz w:val="22"/>
+        </w:rPr>
+        <w:t xml:space="preserve"> </w:t>
+      </w:r>
+      <w:r>
+        <w:rPr>
+          <w:sz w:val="22"/>
+        </w:rPr>
+        <w:t>Transfer</w:t>
       </w:r>
     </w:p>
     <w:p>
@@ -1532,10 +3022,216 @@
       <w:r>
         <w:rPr>
           <w:sz w:val="22"/>
-          <w:szCs w:val="22"/>
-          <w:rtl w:val="0"/>
-        </w:rPr>
-        <w:t xml:space="preserve">Team: Product and Project Management; Technical Leadership; Team Building and Hiring; Technical Communication and Presentations</w:t>
+        </w:rPr>
+        <w:t>Team:</w:t>
+      </w:r>
+      <w:r>
+        <w:rPr>
+          <w:sz w:val="22"/>
+        </w:rPr>
+        <w:t xml:space="preserve"> </w:t>
+      </w:r>
+      <w:r>
+        <w:rPr>
+          <w:sz w:val="22"/>
+        </w:rPr>
+        <w:t>Product</w:t>
+      </w:r>
+      <w:r>
+        <w:rPr>
+          <w:sz w:val="22"/>
+        </w:rPr>
+        <w:t xml:space="preserve"> </w:t>
+      </w:r>
+      <w:r>
+        <w:rPr>
+          <w:sz w:val="22"/>
+        </w:rPr>
+        <w:t>and</w:t>
+      </w:r>
+      <w:r>
+        <w:rPr>
+          <w:sz w:val="22"/>
+        </w:rPr>
+        <w:t xml:space="preserve"> </w:t>
+      </w:r>
+      <w:r>
+        <w:rPr>
+          <w:sz w:val="22"/>
+        </w:rPr>
+        <w:t>Project</w:t>
+      </w:r>
+      <w:r>
+        <w:rPr>
+          <w:sz w:val="22"/>
+        </w:rPr>
+        <w:t xml:space="preserve"> </w:t>
+      </w:r>
+      <w:r>
+        <w:rPr>
+          <w:sz w:val="22"/>
+        </w:rPr>
+        <w:t>Management;</w:t>
+      </w:r>
+      <w:r>
+        <w:rPr>
+          <w:sz w:val="22"/>
+        </w:rPr>
+        <w:t xml:space="preserve"> </w:t>
+      </w:r>
+      <w:r>
+        <w:rPr>
+          <w:sz w:val="22"/>
+        </w:rPr>
+        <w:t>Technical</w:t>
+      </w:r>
+      <w:r>
+        <w:rPr>
+          <w:sz w:val="22"/>
+        </w:rPr>
+        <w:t xml:space="preserve"> </w:t>
+      </w:r>
+      <w:r>
+        <w:rPr>
+          <w:sz w:val="22"/>
+        </w:rPr>
+        <w:t>Leadership;</w:t>
+      </w:r>
+      <w:r>
+        <w:rPr>
+          <w:sz w:val="22"/>
+        </w:rPr>
+        <w:t xml:space="preserve"> </w:t>
+      </w:r>
+      <w:r>
+        <w:rPr>
+          <w:sz w:val="22"/>
+        </w:rPr>
+        <w:t>Team</w:t>
+      </w:r>
+      <w:r>
+        <w:rPr>
+          <w:sz w:val="22"/>
+        </w:rPr>
+        <w:t xml:space="preserve"> </w:t>
+      </w:r>
+      <w:r>
+        <w:rPr>
+          <w:sz w:val="22"/>
+        </w:rPr>
+        <w:t>Building</w:t>
+      </w:r>
+      <w:r>
+        <w:rPr>
+          <w:sz w:val="22"/>
+        </w:rPr>
+        <w:t xml:space="preserve"> </w:t>
+      </w:r>
+      <w:r>
+        <w:rPr>
+          <w:sz w:val="22"/>
+        </w:rPr>
+        <w:t>and</w:t>
+      </w:r>
+      <w:r>
+        <w:rPr>
+          <w:sz w:val="22"/>
+        </w:rPr>
+        <w:t xml:space="preserve"> </w:t>
+      </w:r>
+      <w:r>
+        <w:rPr>
+          <w:sz w:val="22"/>
+        </w:rPr>
+        <w:t>Hiring;</w:t>
+      </w:r>
+      <w:r>
+        <w:rPr>
+          <w:sz w:val="22"/>
+        </w:rPr>
+        <w:t xml:space="preserve"> </w:t>
+      </w:r>
+      <w:r>
+        <w:rPr>
+          <w:sz w:val="22"/>
+        </w:rPr>
+        <w:t>Technical</w:t>
+      </w:r>
+      <w:r>
+        <w:rPr>
+          <w:sz w:val="22"/>
+        </w:rPr>
+        <w:t xml:space="preserve"> </w:t>
+      </w:r>
+      <w:r>
+        <w:rPr>
+          <w:sz w:val="22"/>
+        </w:rPr>
+        <w:t>Communication</w:t>
+      </w:r>
+      <w:r>
+        <w:rPr>
+          <w:sz w:val="22"/>
+        </w:rPr>
+        <w:t xml:space="preserve"> </w:t>
+      </w:r>
+      <w:r>
+        <w:rPr>
+          <w:sz w:val="22"/>
+        </w:rPr>
+        <w:t>and</w:t>
+      </w:r>
+      <w:r>
+        <w:rPr>
+          <w:sz w:val="22"/>
+        </w:rPr>
+        <w:t xml:space="preserve"> </w:t>
+      </w:r>
+      <w:r>
+        <w:rPr>
+          <w:sz w:val="22"/>
+          <w:highlight w:val="yellow"/>
+        </w:rPr>
+        <w:t>Presentations;</w:t>
+      </w:r>
+      <w:r>
+        <w:rPr>
+          <w:sz w:val="22"/>
+        </w:rPr>
+        <w:t xml:space="preserve"> </w:t>
+      </w:r>
+      <w:r>
+        <w:rPr>
+          <w:sz w:val="22"/>
+          <w:highlight w:val="yellow"/>
+        </w:rPr>
+        <w:t>Cross-Functional</w:t>
+      </w:r>
+      <w:r>
+        <w:rPr>
+          <w:sz w:val="22"/>
+        </w:rPr>
+        <w:t xml:space="preserve"> </w:t>
+      </w:r>
+      <w:r>
+        <w:rPr>
+          <w:sz w:val="22"/>
+          <w:highlight w:val="yellow"/>
+        </w:rPr>
+        <w:t>Research</w:t>
+      </w:r>
+      <w:r>
+        <w:rPr>
+          <w:sz w:val="22"/>
+        </w:rPr>
+        <w:t xml:space="preserve"> </w:t>
+      </w:r>
+      <w:r>
+        <w:rPr>
+          <w:sz w:val="22"/>
+          <w:highlight w:val="yellow"/>
+        </w:rPr>
+        <w:t>Collaboration</w:t>
       </w:r>
     </w:p>
     <w:p>

</xml_diff>